<commit_message>
Part 1 report: render in Times New Roman, fix caption capitalisation
Co-Authored-By: Claude Opus 5.5 <noreply@anthropic.com>
Claude-Session: https://claude.ai/code/session_014cHUjWVW99MgkXsaKBnv5R
</commit_message>
<xml_diff>
--- a/11_part1_report/StrucIQ_Project_Part1_Report.docx
+++ b/11_part1_report/StrucIQ_Project_Part1_Report.docx
@@ -4318,7 +4318,7 @@
       <w:r>
         <w:drawing>
           <wp:inline distT="0" distB="0" distL="0" distR="0">
-            <wp:extent cx="5120640" cy="1971190"/>
+            <wp:extent cx="5120640" cy="1967764"/>
             <wp:effectExtent t="0" r="0" b="0" l="0"/>
             <wp:docPr id="3" name="f31_specimen.png" descr="f31_specimen.png" title="f31_specimen.png"/>
             <wp:cNvGraphicFramePr>
@@ -4343,7 +4343,7 @@
                   <pic:spPr bwMode="auto">
                     <a:xfrm>
                       <a:off x="0" y="0"/>
-                      <a:ext cx="5120640" cy="1971190"/>
+                      <a:ext cx="5120640" cy="1967764"/>
                     </a:xfrm>
                     <a:prstGeom prst="rect">
                       <a:avLst/>
@@ -6050,7 +6050,7 @@
           <w:sz w:val="24"/>
           <w:szCs w:val="24"/>
         </w:rPr>
-        <w:t xml:space="preserve"> Blind Prediction Against the Test of Musiał Et Al. (2021)</w:t>
+        <w:t xml:space="preserve"> Blind Prediction Against the Test of Musiał et al. (2021)</w:t>
       </w:r>
     </w:p>
     <w:tbl>
@@ -6835,7 +6835,7 @@
             <w:r>
               <w:drawing>
                 <wp:inline distT="0" distB="0" distL="0" distR="0">
-                  <wp:extent cx="2743200" cy="2055290"/>
+                  <wp:extent cx="2743200" cy="2054937"/>
                   <wp:effectExtent t="0" r="0" b="0" l="0"/>
                   <wp:docPr id="7" name="f43_counts.png" descr="f43_counts.png" title="f43_counts.png"/>
                   <wp:cNvGraphicFramePr>
@@ -6860,7 +6860,7 @@
                         <pic:spPr bwMode="auto">
                           <a:xfrm>
                             <a:off x="0" y="0"/>
-                            <a:ext cx="2743200" cy="2055290"/>
+                            <a:ext cx="2743200" cy="2054937"/>
                           </a:xfrm>
                           <a:prstGeom prst="rect">
                             <a:avLst/>
@@ -11699,7 +11699,7 @@
             <w:r>
               <w:drawing>
                 <wp:inline distT="0" distB="0" distL="0" distR="0">
-                  <wp:extent cx="2743200" cy="2397577"/>
+                  <wp:extent cx="2743200" cy="2397394"/>
                   <wp:effectExtent t="0" r="0" b="0" l="0"/>
                   <wp:docPr id="9" name="f47_static_vib.png" descr="f47_static_vib.png" title="f47_static_vib.png"/>
                   <wp:cNvGraphicFramePr>
@@ -11724,7 +11724,7 @@
                         <pic:spPr bwMode="auto">
                           <a:xfrm>
                             <a:off x="0" y="0"/>
-                            <a:ext cx="2743200" cy="2397577"/>
+                            <a:ext cx="2743200" cy="2397394"/>
                           </a:xfrm>
                           <a:prstGeom prst="rect">
                             <a:avLst/>
@@ -11782,7 +11782,7 @@
             <w:r>
               <w:drawing>
                 <wp:inline distT="0" distB="0" distL="0" distR="0">
-                  <wp:extent cx="2743200" cy="2436786"/>
+                  <wp:extent cx="2743200" cy="2438077"/>
                   <wp:effectExtent t="0" r="0" b="0" l="0"/>
                   <wp:docPr id="10" name="f48_sustained.png" descr="f48_sustained.png" title="f48_sustained.png"/>
                   <wp:cNvGraphicFramePr>
@@ -11807,7 +11807,7 @@
                         <pic:spPr bwMode="auto">
                           <a:xfrm>
                             <a:off x="0" y="0"/>
-                            <a:ext cx="2743200" cy="2436786"/>
+                            <a:ext cx="2743200" cy="2438077"/>
                           </a:xfrm>
                           <a:prstGeom prst="rect">
                             <a:avLst/>
@@ -11868,7 +11868,25 @@
         <w:jc w:val="both"/>
       </w:pPr>
       <w:r>
-        <w:t xml:space="preserve">Table A-3 summarises the condition stages. Strengthening simulated in the model raised the peak load by a median of 18% with laminates, 36% with a steel plate and 44% with a concrete jacket; on the strengthened beams of Musiał et al. (2021) the same approach predicted 79.4 and 105.9 kN against 90.2 and 116.0 kN tested, 9% to 12% on the safe side. Corrosion of 5%, 10% and 15% reduced the peak load to 0.91, 0.84 and 0.78 of the uncorroded beam, and only 32%, 12% and 4% of corroded beams could still carry the last stage load, against 79% uncorroded. Under sustained service load the deflection grew by a median of 2.7 times in 50 years (Figure A-2), 0.90 of the IS 456:2000 Annex C estimate, while the crack width grew from 0.02 to 0.09 mm. The design fatigue life of the tension steel fell from about 4 × 10¹⁰ cycles at the first stage to 0.9 × 10⁶ at the last.</w:t>
+        <w:t xml:space="preserve">Table A-3 summarises the condition stages. Strengthening simulated in the model raised the peak load by a median of 18% with laminates, 36% with a steel plate and 44% with a concrete jacket; on the strengthened beams of Musiał et al. (2021) the same approach predicted 79.4 and 105.9 kN against 90.2 and 116.0 kN tested, 9% to 12% on the safe side. Corrosion of 5%, 10% and 15% reduced the peak load to 0.91, 0.84 and 0.78 of the uncorroded beam, and only 32%, 12% and 4% of corroded beams could still carry the last stage load, against 79% uncorroded. Under sustained service load the deflection grew by a median of 2.7 times in 50 years (Figure A-2), 0.90 of the IS 456:2000 Annex C estimate, while the crack width grew from 0.02 to 0.09 mm. The design fatigue life of the tension steel fell from about 4 × 10</w:t>
+      </w:r>
+      <w:r>
+        <w:rPr>
+          <w:vertAlign w:val="superscript"/>
+        </w:rPr>
+        <w:t xml:space="preserve">10</w:t>
+      </w:r>
+      <w:r>
+        <w:t xml:space="preserve"> cycles at the first stage to 0.9 × 10</w:t>
+      </w:r>
+      <w:r>
+        <w:rPr>
+          <w:vertAlign w:val="superscript"/>
+        </w:rPr>
+        <w:t xml:space="preserve">6</w:t>
+      </w:r>
+      <w:r>
+        <w:t xml:space="preserve"> at the last.</w:t>
       </w:r>
     </w:p>
     <w:p>
@@ -12560,7 +12578,45 @@
                 <w:sz w:val="22"/>
                 <w:szCs w:val="22"/>
               </w:rPr>
-              <w:t xml:space="preserve">Design life 4 × 10¹⁰ cycles at stage 1 to 0.9 × 10⁶ at stage 5</w:t>
+              <w:t xml:space="preserve">Design life 4 × 10</w:t>
+            </w:r>
+            <w:r>
+              <w:rPr>
+                <w:b w:val="false"/>
+                <w:bCs w:val="false"/>
+                <w:sz w:val="22"/>
+                <w:szCs w:val="22"/>
+                <w:vertAlign w:val="superscript"/>
+              </w:rPr>
+              <w:t xml:space="preserve">10</w:t>
+            </w:r>
+            <w:r>
+              <w:rPr>
+                <w:b w:val="false"/>
+                <w:bCs w:val="false"/>
+                <w:sz w:val="22"/>
+                <w:szCs w:val="22"/>
+              </w:rPr>
+              <w:t xml:space="preserve"> cycles at stage 1 to 0.9 × 10</w:t>
+            </w:r>
+            <w:r>
+              <w:rPr>
+                <w:b w:val="false"/>
+                <w:bCs w:val="false"/>
+                <w:sz w:val="22"/>
+                <w:szCs w:val="22"/>
+                <w:vertAlign w:val="superscript"/>
+              </w:rPr>
+              <w:t xml:space="preserve">6</w:t>
+            </w:r>
+            <w:r>
+              <w:rPr>
+                <w:b w:val="false"/>
+                <w:bCs w:val="false"/>
+                <w:sz w:val="22"/>
+                <w:szCs w:val="22"/>
+              </w:rPr>
+              <w:t xml:space="preserve"> at stage 5</w:t>
             </w:r>
           </w:p>
         </w:tc>
@@ -13379,7 +13435,7 @@
           <w:sz w:val="24"/>
           <w:szCs w:val="24"/>
         </w:rPr>
-        <w:t xml:space="preserve"> Predicted and Measured Capacities, Ozturkoglu Et Al. (2024)</w:t>
+        <w:t xml:space="preserve"> Predicted and Measured Capacities, Ozturkoglu et al. (2024)</w:t>
       </w:r>
     </w:p>
     <w:tbl>

</xml_diff>

<commit_message>
Part 1 report: justify references, add scikit-learn ACM identifier
Co-Authored-By: Claude Opus 5.5 <noreply@anthropic.com>
Claude-Session: https://claude.ai/code/session_014cHUjWVW99MgkXsaKBnv5R
</commit_message>
<xml_diff>
--- a/11_part1_report/StrucIQ_Project_Part1_Report.docx
+++ b/11_part1_report/StrucIQ_Project_Part1_Report.docx
@@ -8693,7 +8693,7 @@
       <w:pPr>
         <w:spacing w:after="0" w:line="360"/>
         <w:ind w:left="480" w:hanging="480"/>
-        <w:jc w:val="left"/>
+        <w:jc w:val="both"/>
       </w:pPr>
       <w:r>
         <w:rPr>
@@ -8723,7 +8723,7 @@
       <w:pPr>
         <w:spacing w:after="0" w:line="360"/>
         <w:ind w:left="480" w:hanging="480"/>
-        <w:jc w:val="left"/>
+        <w:jc w:val="both"/>
       </w:pPr>
       <w:r>
         <w:rPr>
@@ -8753,7 +8753,7 @@
       <w:pPr>
         <w:spacing w:after="0" w:line="360"/>
         <w:ind w:left="480" w:hanging="480"/>
-        <w:jc w:val="left"/>
+        <w:jc w:val="both"/>
       </w:pPr>
       <w:r>
         <w:rPr>
@@ -8783,7 +8783,7 @@
       <w:pPr>
         <w:spacing w:after="0" w:line="360"/>
         <w:ind w:left="480" w:hanging="480"/>
-        <w:jc w:val="left"/>
+        <w:jc w:val="both"/>
       </w:pPr>
       <w:r>
         <w:rPr>
@@ -8813,7 +8813,7 @@
       <w:pPr>
         <w:spacing w:after="0" w:line="360"/>
         <w:ind w:left="480" w:hanging="480"/>
-        <w:jc w:val="left"/>
+        <w:jc w:val="both"/>
       </w:pPr>
       <w:r>
         <w:rPr>
@@ -8843,7 +8843,7 @@
       <w:pPr>
         <w:spacing w:after="0" w:line="360"/>
         <w:ind w:left="480" w:hanging="480"/>
-        <w:jc w:val="left"/>
+        <w:jc w:val="both"/>
       </w:pPr>
       <w:r>
         <w:rPr>
@@ -8873,7 +8873,7 @@
       <w:pPr>
         <w:spacing w:after="0" w:line="360"/>
         <w:ind w:left="480" w:hanging="480"/>
-        <w:jc w:val="left"/>
+        <w:jc w:val="both"/>
       </w:pPr>
       <w:r>
         <w:rPr>
@@ -8903,7 +8903,7 @@
       <w:pPr>
         <w:spacing w:after="0" w:line="360"/>
         <w:ind w:left="480" w:hanging="480"/>
-        <w:jc w:val="left"/>
+        <w:jc w:val="both"/>
       </w:pPr>
       <w:r>
         <w:rPr>
@@ -8933,7 +8933,7 @@
       <w:pPr>
         <w:spacing w:after="0" w:line="360"/>
         <w:ind w:left="480" w:hanging="480"/>
-        <w:jc w:val="left"/>
+        <w:jc w:val="both"/>
       </w:pPr>
       <w:r>
         <w:rPr>
@@ -8963,7 +8963,7 @@
       <w:pPr>
         <w:spacing w:after="0" w:line="360"/>
         <w:ind w:left="480" w:hanging="480"/>
-        <w:jc w:val="left"/>
+        <w:jc w:val="both"/>
       </w:pPr>
       <w:r>
         <w:rPr>
@@ -8993,7 +8993,7 @@
       <w:pPr>
         <w:spacing w:after="0" w:line="360"/>
         <w:ind w:left="480" w:hanging="480"/>
-        <w:jc w:val="left"/>
+        <w:jc w:val="both"/>
       </w:pPr>
       <w:r>
         <w:rPr>
@@ -9023,7 +9023,7 @@
       <w:pPr>
         <w:spacing w:after="0" w:line="360"/>
         <w:ind w:left="480" w:hanging="480"/>
-        <w:jc w:val="left"/>
+        <w:jc w:val="both"/>
       </w:pPr>
       <w:r>
         <w:rPr>
@@ -9053,7 +9053,7 @@
       <w:pPr>
         <w:spacing w:after="0" w:line="360"/>
         <w:ind w:left="480" w:hanging="480"/>
-        <w:jc w:val="left"/>
+        <w:jc w:val="both"/>
       </w:pPr>
       <w:r>
         <w:rPr>
@@ -9083,7 +9083,7 @@
       <w:pPr>
         <w:spacing w:after="0" w:line="360"/>
         <w:ind w:left="480" w:hanging="480"/>
-        <w:jc w:val="left"/>
+        <w:jc w:val="both"/>
       </w:pPr>
       <w:r>
         <w:rPr>
@@ -9113,7 +9113,7 @@
       <w:pPr>
         <w:spacing w:after="0" w:line="360"/>
         <w:ind w:left="480" w:hanging="480"/>
-        <w:jc w:val="left"/>
+        <w:jc w:val="both"/>
       </w:pPr>
       <w:r>
         <w:rPr>
@@ -9143,7 +9143,7 @@
       <w:pPr>
         <w:spacing w:after="0" w:line="360"/>
         <w:ind w:left="480" w:hanging="480"/>
-        <w:jc w:val="left"/>
+        <w:jc w:val="both"/>
       </w:pPr>
       <w:r>
         <w:rPr>
@@ -9173,7 +9173,7 @@
       <w:pPr>
         <w:spacing w:after="0" w:line="360"/>
         <w:ind w:left="480" w:hanging="480"/>
-        <w:jc w:val="left"/>
+        <w:jc w:val="both"/>
       </w:pPr>
       <w:r>
         <w:rPr>
@@ -9203,7 +9203,7 @@
       <w:pPr>
         <w:spacing w:after="0" w:line="360"/>
         <w:ind w:left="480" w:hanging="480"/>
-        <w:jc w:val="left"/>
+        <w:jc w:val="both"/>
       </w:pPr>
       <w:r>
         <w:rPr>
@@ -9233,7 +9233,7 @@
       <w:pPr>
         <w:spacing w:after="0" w:line="360"/>
         <w:ind w:left="480" w:hanging="480"/>
-        <w:jc w:val="left"/>
+        <w:jc w:val="both"/>
       </w:pPr>
       <w:r>
         <w:rPr>
@@ -9263,7 +9263,7 @@
       <w:pPr>
         <w:spacing w:after="0" w:line="360"/>
         <w:ind w:left="480" w:hanging="480"/>
-        <w:jc w:val="left"/>
+        <w:jc w:val="both"/>
       </w:pPr>
       <w:r>
         <w:rPr>
@@ -9293,7 +9293,7 @@
       <w:pPr>
         <w:spacing w:after="0" w:line="360"/>
         <w:ind w:left="480" w:hanging="480"/>
-        <w:jc w:val="left"/>
+        <w:jc w:val="both"/>
       </w:pPr>
       <w:r>
         <w:rPr>
@@ -9323,7 +9323,7 @@
       <w:pPr>
         <w:spacing w:after="0" w:line="360"/>
         <w:ind w:left="480" w:hanging="480"/>
-        <w:jc w:val="left"/>
+        <w:jc w:val="both"/>
       </w:pPr>
       <w:r>
         <w:rPr>
@@ -9353,7 +9353,7 @@
       <w:pPr>
         <w:spacing w:after="0" w:line="360"/>
         <w:ind w:left="480" w:hanging="480"/>
-        <w:jc w:val="left"/>
+        <w:jc w:val="both"/>
       </w:pPr>
       <w:r>
         <w:rPr>
@@ -9376,14 +9376,14 @@
           <w:sz w:val="24"/>
           <w:szCs w:val="24"/>
         </w:rPr>
-        <w:t xml:space="preserve">, 2825–2830.</w:t>
+        <w:t xml:space="preserve">, 2825–2830. https://dl.acm.org/doi/10.5555/1953048.2078195</w:t>
       </w:r>
     </w:p>
     <w:p>
       <w:pPr>
         <w:spacing w:after="0" w:line="360"/>
         <w:ind w:left="480" w:hanging="480"/>
-        <w:jc w:val="left"/>
+        <w:jc w:val="both"/>
       </w:pPr>
       <w:r>
         <w:rPr>
@@ -9413,7 +9413,7 @@
       <w:pPr>
         <w:spacing w:after="0" w:line="360"/>
         <w:ind w:left="480" w:hanging="480"/>
-        <w:jc w:val="left"/>
+        <w:jc w:val="both"/>
       </w:pPr>
       <w:r>
         <w:rPr>
@@ -9443,7 +9443,7 @@
       <w:pPr>
         <w:spacing w:after="0" w:line="360"/>
         <w:ind w:left="480" w:hanging="480"/>
-        <w:jc w:val="left"/>
+        <w:jc w:val="both"/>
       </w:pPr>
       <w:r>
         <w:rPr>
@@ -9473,7 +9473,7 @@
       <w:pPr>
         <w:spacing w:after="0" w:line="360"/>
         <w:ind w:left="480" w:hanging="480"/>
-        <w:jc w:val="left"/>
+        <w:jc w:val="both"/>
       </w:pPr>
       <w:r>
         <w:rPr>
@@ -9503,7 +9503,7 @@
       <w:pPr>
         <w:spacing w:after="0" w:line="360"/>
         <w:ind w:left="480" w:hanging="480"/>
-        <w:jc w:val="left"/>
+        <w:jc w:val="both"/>
       </w:pPr>
       <w:r>
         <w:rPr>
@@ -9533,7 +9533,7 @@
       <w:pPr>
         <w:spacing w:after="0" w:line="360"/>
         <w:ind w:left="480" w:hanging="480"/>
-        <w:jc w:val="left"/>
+        <w:jc w:val="both"/>
       </w:pPr>
       <w:r>
         <w:rPr>
@@ -9563,7 +9563,7 @@
       <w:pPr>
         <w:spacing w:after="0" w:line="360"/>
         <w:ind w:left="480" w:hanging="480"/>
-        <w:jc w:val="left"/>
+        <w:jc w:val="both"/>
       </w:pPr>
       <w:r>
         <w:rPr>
@@ -9593,7 +9593,7 @@
       <w:pPr>
         <w:spacing w:after="0" w:line="360"/>
         <w:ind w:left="480" w:hanging="480"/>
-        <w:jc w:val="left"/>
+        <w:jc w:val="both"/>
       </w:pPr>
       <w:r>
         <w:rPr>
@@ -9623,7 +9623,7 @@
       <w:pPr>
         <w:spacing w:after="0" w:line="360"/>
         <w:ind w:left="480" w:hanging="480"/>
-        <w:jc w:val="left"/>
+        <w:jc w:val="both"/>
       </w:pPr>
       <w:r>
         <w:rPr>
@@ -9653,7 +9653,7 @@
       <w:pPr>
         <w:spacing w:after="0" w:line="360"/>
         <w:ind w:left="480" w:hanging="480"/>
-        <w:jc w:val="left"/>
+        <w:jc w:val="both"/>
       </w:pPr>
       <w:r>
         <w:rPr>

</xml_diff>

<commit_message>
Part 1 report: make references consistent
Add missing DOIs (Du et al. 2005a, b), put standard numbers after titles
for all codes, allow URL line breaks so justified lines are not stretched.

Co-Authored-By: Claude Opus 5.5 <noreply@anthropic.com>
Claude-Session: https://claude.ai/code/session_014cHUjWVW99MgkXsaKBnv5R
</commit_message>
<xml_diff>
--- a/11_part1_report/StrucIQ_Project_Part1_Report.docx
+++ b/11_part1_report/StrucIQ_Project_Part1_Report.docx
@@ -8155,10 +8155,10 @@
       </w:tblPr>
       <w:tblGrid>
         <w:gridCol w:w="500"/>
-        <w:gridCol w:w="1500"/>
-        <w:gridCol w:w="3500"/>
+        <w:gridCol w:w="1400"/>
+        <w:gridCol w:w="3300"/>
         <w:gridCol w:w="1200"/>
-        <w:gridCol w:w="2326"/>
+        <w:gridCol w:w="2626"/>
       </w:tblGrid>
       <w:tr>
         <w:trPr>
@@ -8199,7 +8199,7 @@
         </w:tc>
         <w:tc>
           <w:tcPr>
-            <w:tcW w:type="dxa" w:w="1500"/>
+            <w:tcW w:type="dxa" w:w="1400"/>
             <w:tcBorders>
               <w:top w:val="single" w:color="000000" w:sz="8"/>
               <w:left w:val="none" w:color="FFFFFF" w:sz="0"/>
@@ -8232,7 +8232,7 @@
         </w:tc>
         <w:tc>
           <w:tcPr>
-            <w:tcW w:type="dxa" w:w="3500"/>
+            <w:tcW w:type="dxa" w:w="3300"/>
             <w:tcBorders>
               <w:top w:val="single" w:color="000000" w:sz="8"/>
               <w:left w:val="none" w:color="FFFFFF" w:sz="0"/>
@@ -8298,7 +8298,7 @@
         </w:tc>
         <w:tc>
           <w:tcPr>
-            <w:tcW w:type="dxa" w:w="2326"/>
+            <w:tcW w:type="dxa" w:w="2626"/>
             <w:tcBorders>
               <w:top w:val="single" w:color="000000" w:sz="8"/>
               <w:left w:val="none" w:color="FFFFFF" w:sz="0"/>
@@ -8369,7 +8369,7 @@
         </w:tc>
         <w:tc>
           <w:tcPr>
-            <w:tcW w:type="dxa" w:w="1500"/>
+            <w:tcW w:type="dxa" w:w="1400"/>
             <w:tcBorders>
               <w:top w:val="none" w:color="FFFFFF" w:sz="0"/>
               <w:left w:val="none" w:color="FFFFFF" w:sz="0"/>
@@ -8402,7 +8402,7 @@
         </w:tc>
         <w:tc>
           <w:tcPr>
-            <w:tcW w:type="dxa" w:w="3500"/>
+            <w:tcW w:type="dxa" w:w="3300"/>
             <w:tcBorders>
               <w:top w:val="none" w:color="FFFFFF" w:sz="0"/>
               <w:left w:val="none" w:color="FFFFFF" w:sz="0"/>
@@ -8468,7 +8468,7 @@
         </w:tc>
         <w:tc>
           <w:tcPr>
-            <w:tcW w:type="dxa" w:w="2326"/>
+            <w:tcW w:type="dxa" w:w="2626"/>
             <w:tcBorders>
               <w:top w:val="none" w:color="FFFFFF" w:sz="0"/>
               <w:left w:val="none" w:color="FFFFFF" w:sz="0"/>
@@ -8539,7 +8539,7 @@
         </w:tc>
         <w:tc>
           <w:tcPr>
-            <w:tcW w:type="dxa" w:w="1500"/>
+            <w:tcW w:type="dxa" w:w="1400"/>
             <w:tcBorders>
               <w:top w:val="none" w:color="FFFFFF" w:sz="0"/>
               <w:left w:val="none" w:color="FFFFFF" w:sz="0"/>
@@ -8572,7 +8572,7 @@
         </w:tc>
         <w:tc>
           <w:tcPr>
-            <w:tcW w:type="dxa" w:w="3500"/>
+            <w:tcW w:type="dxa" w:w="3300"/>
             <w:tcBorders>
               <w:top w:val="none" w:color="FFFFFF" w:sz="0"/>
               <w:left w:val="none" w:color="FFFFFF" w:sz="0"/>
@@ -8638,7 +8638,7 @@
         </w:tc>
         <w:tc>
           <w:tcPr>
-            <w:tcW w:type="dxa" w:w="2326"/>
+            <w:tcW w:type="dxa" w:w="2626"/>
             <w:tcBorders>
               <w:top w:val="none" w:color="FFFFFF" w:sz="0"/>
               <w:left w:val="none" w:color="FFFFFF" w:sz="0"/>
@@ -8836,7 +8836,7 @@
           <w:sz w:val="24"/>
           <w:szCs w:val="24"/>
         </w:rPr>
-        <w:t xml:space="preserve">(4), 455–461. https://doi.org/10.1061/(ASCE)0733-9399(1998)124:4(455)</w:t>
+        <w:t xml:space="preserve">(4), 455–461. https://doi.​org/​10.​1061/​(ASCE)​0733-9399(1998)​124:​4(455)​</w:t>
       </w:r>
     </w:p>
     <w:p>
@@ -8859,14 +8859,14 @@
           <w:sz w:val="24"/>
           <w:szCs w:val="24"/>
         </w:rPr>
-        <w:t xml:space="preserve">IS 456:2000 Plain and reinforced concrete: Code of practice</w:t>
+        <w:t xml:space="preserve">Plain and reinforced concrete: Code of practice</w:t>
       </w:r>
       <w:r>
         <w:rPr>
           <w:sz w:val="24"/>
           <w:szCs w:val="24"/>
         </w:rPr>
-        <w:t xml:space="preserve"> (4th rev.). Bureau of Indian Standards.</w:t>
+        <w:t xml:space="preserve"> (IS 456:2000, 4th rev.). Bureau of Indian Standards.</w:t>
       </w:r>
     </w:p>
     <w:p>
@@ -8889,14 +8889,14 @@
           <w:sz w:val="24"/>
           <w:szCs w:val="24"/>
         </w:rPr>
-        <w:t xml:space="preserve">IS 15988:2013 Seismic evaluation and strengthening of existing reinforced concrete buildings: Guidelines</w:t>
+        <w:t xml:space="preserve">Seismic evaluation and strengthening of existing reinforced concrete buildings: Guidelines</w:t>
       </w:r>
       <w:r>
         <w:rPr>
           <w:sz w:val="24"/>
           <w:szCs w:val="24"/>
         </w:rPr>
-        <w:t xml:space="preserve">. Bureau of Indian Standards.</w:t>
+        <w:t xml:space="preserve"> (IS 15988:2013). Bureau of Indian Standards.</w:t>
       </w:r>
     </w:p>
     <w:p>
@@ -8919,14 +8919,14 @@
           <w:sz w:val="24"/>
           <w:szCs w:val="24"/>
         </w:rPr>
-        <w:t xml:space="preserve">IS 1893 (Part 1):2016 Criteria for earthquake resistant design of structures, Part 1: General provisions and buildings</w:t>
+        <w:t xml:space="preserve">Criteria for earthquake resistant design of structures, Part 1: General provisions and buildings</w:t>
       </w:r>
       <w:r>
         <w:rPr>
           <w:sz w:val="24"/>
           <w:szCs w:val="24"/>
         </w:rPr>
-        <w:t xml:space="preserve"> (6th rev.). Bureau of Indian Standards.</w:t>
+        <w:t xml:space="preserve"> (IS 1893 (Part 1):2016, 6th rev.). Bureau of Indian Standards.</w:t>
       </w:r>
     </w:p>
     <w:p>
@@ -8956,7 +8956,7 @@
           <w:sz w:val="24"/>
           <w:szCs w:val="24"/>
         </w:rPr>
-        <w:t xml:space="preserve">(8), 1214–1224. https://doi.org/10.1061/(ASCE)0733-9445(2004)130:8(1214)</w:t>
+        <w:t xml:space="preserve">(8), 1214–1224. https://doi.​org/​10.​1061/​(ASCE)​0733-9445(2004)​130:​8(1214)​</w:t>
       </w:r>
     </w:p>
     <w:p>
@@ -8986,7 +8986,7 @@
           <w:sz w:val="24"/>
           <w:szCs w:val="24"/>
         </w:rPr>
-        <w:t xml:space="preserve">(3), 135–147.</w:t>
+        <w:t xml:space="preserve">(3), 135–147. https://doi.​org/​10.​1680/​macr.​57.​3.​135.​60482</w:t>
       </w:r>
     </w:p>
     <w:p>
@@ -9016,7 +9016,7 @@
           <w:sz w:val="24"/>
           <w:szCs w:val="24"/>
         </w:rPr>
-        <w:t xml:space="preserve">(7), 407–419.</w:t>
+        <w:t xml:space="preserve">(7), 407–419. https://doi.​org/​10.​1680/​macr.​2005.​57.​7.​407</w:t>
       </w:r>
     </w:p>
     <w:p>
@@ -9046,7 +9046,7 @@
           <w:sz w:val="24"/>
           <w:szCs w:val="24"/>
         </w:rPr>
-        <w:t xml:space="preserve">(1), 1–26. https://doi.org/10.1214/aos/1176344552</w:t>
+        <w:t xml:space="preserve">(1), 1–26. https://doi.​org/​10.​1214/​aos/​1176344552</w:t>
       </w:r>
     </w:p>
     <w:p>
@@ -9069,14 +9069,14 @@
           <w:sz w:val="24"/>
           <w:szCs w:val="24"/>
         </w:rPr>
-        <w:t xml:space="preserve">EN 1992-1-1:2004 Eurocode 2: Design of concrete structures, Part 1-1: General rules and rules for buildings</w:t>
+        <w:t xml:space="preserve">Eurocode 2: Design of concrete structures, Part 1-1: General rules and rules for buildings</w:t>
       </w:r>
       <w:r>
         <w:rPr>
           <w:sz w:val="24"/>
           <w:szCs w:val="24"/>
         </w:rPr>
-        <w:t xml:space="preserve">. European Committee for Standardization.</w:t>
+        <w:t xml:space="preserve"> (EN 1992-1-1:2004). European Committee for Standardization.</w:t>
       </w:r>
     </w:p>
     <w:p>
@@ -9106,7 +9106,7 @@
           <w:sz w:val="24"/>
           <w:szCs w:val="24"/>
         </w:rPr>
-        <w:t xml:space="preserve">(1), 83–111. https://doi.org/10.1177/1475921710365419</w:t>
+        <w:t xml:space="preserve">(1), 83–111. https://doi.​org/​10.​1177/​1475921710365419</w:t>
       </w:r>
     </w:p>
     <w:p>
@@ -9136,7 +9136,7 @@
           <w:sz w:val="24"/>
           <w:szCs w:val="24"/>
         </w:rPr>
-        <w:t xml:space="preserve">(5), 337–347. https://doi.org/10.1038/s43588-021-00069-0</w:t>
+        <w:t xml:space="preserve">(5), 337–347. https://doi.​org/​10.​1038/​s43588-021-00069-0</w:t>
       </w:r>
     </w:p>
     <w:p>
@@ -9166,7 +9166,7 @@
           <w:sz w:val="24"/>
           <w:szCs w:val="24"/>
         </w:rPr>
-        <w:t xml:space="preserve">(1), 175–190. https://doi.org/10.14359/51701153</w:t>
+        <w:t xml:space="preserve">(1), 175–190. https://doi.​org/​10.​14359/​51701153</w:t>
       </w:r>
     </w:p>
     <w:p>
@@ -9180,7 +9180,7 @@
           <w:sz w:val="24"/>
           <w:szCs w:val="24"/>
         </w:rPr>
-        <w:t xml:space="preserve">Maeck, J., &amp; De Roeck, G. (2003). Damage assessment using vibration analysis on the Z24-bridge. </w:t>
+        <w:t xml:space="preserve">Maeck, J., &amp; De Roeck, G. (2003). Damage assessment using vibration analysis on the Z24-Bridge. </w:t>
       </w:r>
       <w:r>
         <w:rPr>
@@ -9196,7 +9196,7 @@
           <w:sz w:val="24"/>
           <w:szCs w:val="24"/>
         </w:rPr>
-        <w:t xml:space="preserve">(1), 133–142. https://doi.org/10.1006/mssp.2002.1550</w:t>
+        <w:t xml:space="preserve">(1), 133–142. https://doi.​org/​10.​1006/​mssp.​2002.​1550</w:t>
       </w:r>
     </w:p>
     <w:p>
@@ -9226,7 +9226,7 @@
           <w:sz w:val="24"/>
           <w:szCs w:val="24"/>
         </w:rPr>
-        <w:t xml:space="preserve">(2), 239–245. https://doi.org/10.1080/00401706.1979.10489755</w:t>
+        <w:t xml:space="preserve">(2), 239–245. https://doi.​org/​10.​1080/​00401706.​1979.​10489755</w:t>
       </w:r>
     </w:p>
     <w:p>
@@ -9256,7 +9256,7 @@
           <w:sz w:val="24"/>
           <w:szCs w:val="24"/>
         </w:rPr>
-        <w:t xml:space="preserve">(4), 58–66. https://doi.org/10.1109/MCSE.2011.66</w:t>
+        <w:t xml:space="preserve">(4), 58–66. https://doi.​org/​10.​1109/​MCSE.​2011.​66</w:t>
       </w:r>
     </w:p>
     <w:p>
@@ -9286,7 +9286,7 @@
           <w:sz w:val="24"/>
           <w:szCs w:val="24"/>
         </w:rPr>
-        <w:t xml:space="preserve">(4), 910. https://doi.org/10.3390/ma14040910</w:t>
+        <w:t xml:space="preserve">(4), 910. https://doi.​org/​10.​3390/​ma14040910</w:t>
       </w:r>
     </w:p>
     <w:p>
@@ -9316,7 +9316,7 @@
           <w:sz w:val="24"/>
           <w:szCs w:val="24"/>
         </w:rPr>
-        <w:t xml:space="preserve">(21), 9920. https://doi.org/10.3390/app14219920</w:t>
+        <w:t xml:space="preserve">(21), 9920. https://doi.​org/​10.​3390/​app14219920</w:t>
       </w:r>
     </w:p>
     <w:p>
@@ -9346,7 +9346,7 @@
           <w:sz w:val="24"/>
           <w:szCs w:val="24"/>
         </w:rPr>
-        <w:t xml:space="preserve">(4), 722–739. https://doi.org/10.1061/(ASCE)0733-9445(1985)111:4(722)</w:t>
+        <w:t xml:space="preserve">(4), 722–739. https://doi.​org/​10.​1061/​(ASCE)​0733-9445(1985)​111:​4(722)​</w:t>
       </w:r>
     </w:p>
     <w:p>
@@ -9376,7 +9376,7 @@
           <w:sz w:val="24"/>
           <w:szCs w:val="24"/>
         </w:rPr>
-        <w:t xml:space="preserve">, 2825–2830. https://dl.acm.org/doi/10.5555/1953048.2078195</w:t>
+        <w:t xml:space="preserve">, 2825–2830. https://dl.​acm.​org/​doi/​10.​5555/​1953048.​2078195</w:t>
       </w:r>
     </w:p>
     <w:p>
@@ -9406,7 +9406,7 @@
           <w:sz w:val="24"/>
           <w:szCs w:val="24"/>
         </w:rPr>
-        <w:t xml:space="preserve">(2), 149–171. https://doi.org/10.1002/1096-9845(200102)30:2&lt;149::AID-EQE1&gt;3.0.CO;2-Z</w:t>
+        <w:t xml:space="preserve">(2), 149–171. https://doi.​org/​10.​1002/​1096-9845(200102)​30:​2&lt;149:​:​AID-EQE1&gt;3.​0.​CO;​2-Z</w:t>
       </w:r>
     </w:p>
     <w:p>
@@ -9436,7 +9436,7 @@
           <w:sz w:val="24"/>
           <w:szCs w:val="24"/>
         </w:rPr>
-        <w:t xml:space="preserve"> (Version 1.0) [Data set]. Zenodo. https://doi.org/10.5281/zenodo.23769960</w:t>
+        <w:t xml:space="preserve"> (Version 1.0) [Data set]. Zenodo. https://doi.​org/​10.​5281/​zenodo.​23769960</w:t>
       </w:r>
     </w:p>
     <w:p>
@@ -9466,7 +9466,7 @@
           <w:sz w:val="24"/>
           <w:szCs w:val="24"/>
         </w:rPr>
-        <w:t xml:space="preserve"> [Computer software]. GitHub. https://github.com/SreekarAditya/BE-Major-Project</w:t>
+        <w:t xml:space="preserve"> [Computer software]. GitHub. https://github.​com/​SreekarAditya/​BE-Major-Project</w:t>
       </w:r>
     </w:p>
     <w:p>
@@ -9496,7 +9496,7 @@
           <w:sz w:val="24"/>
           <w:szCs w:val="24"/>
         </w:rPr>
-        <w:t xml:space="preserve">, 15–27. https://doi.org/10.1016/j.engstruct.2015.07.037</w:t>
+        <w:t xml:space="preserve">, 15–27. https://doi.​org/​10.​1016/​j.​engstruct.​2015.​07.​037</w:t>
       </w:r>
     </w:p>
     <w:p>
@@ -9526,7 +9526,7 @@
           <w:sz w:val="24"/>
           <w:szCs w:val="24"/>
         </w:rPr>
-        <w:t xml:space="preserve">(11), 1525–1532. https://doi.org/10.1016/S0008-8846(01)00546-4</w:t>
+        <w:t xml:space="preserve">(11), 1525–1532. https://doi.​org/​10.​1016/​S0008-8846(01)​00546-4</w:t>
       </w:r>
     </w:p>
     <w:p>
@@ -9556,7 +9556,7 @@
           <w:sz w:val="24"/>
           <w:szCs w:val="24"/>
         </w:rPr>
-        <w:t xml:space="preserve">(2), 259–270. https://doi.org/10.1016/j.cpc.2009.09.018</w:t>
+        <w:t xml:space="preserve">(2), 259–270. https://doi.​org/​10.​1016/​j.​cpc.​2009.​09.​018</w:t>
       </w:r>
     </w:p>
     <w:p>
@@ -9586,7 +9586,7 @@
           <w:sz w:val="24"/>
           <w:szCs w:val="24"/>
         </w:rPr>
-        <w:t xml:space="preserve">(1–3), 271–280. https://doi.org/10.1016/S0378-4754(00)00270-6</w:t>
+        <w:t xml:space="preserve">(1–3), 271–280. https://doi.​org/​10.​1016/​S0378-4754(00)​00270-6</w:t>
       </w:r>
     </w:p>
     <w:p>
@@ -9616,7 +9616,7 @@
           <w:sz w:val="24"/>
           <w:szCs w:val="24"/>
         </w:rPr>
-        <w:t xml:space="preserve">(7), 711–725. https://doi.org/10.1002/(SICI)1096-9845(199607)25:7&lt;711::AID-EQE576&gt;3.0.CO;2-9</w:t>
+        <w:t xml:space="preserve">(7), 711–725. https://doi.​org/​10.​1002/​(SICI)​1096-9845(199607)​25:​7&lt;711:​:​AID-EQE576&gt;3.​0.​CO;​2-9</w:t>
       </w:r>
     </w:p>
     <w:p>
@@ -9646,7 +9646,7 @@
           <w:sz w:val="24"/>
           <w:szCs w:val="24"/>
         </w:rPr>
-        <w:t xml:space="preserve">(6–7), 447–462. https://doi.org/10.1016/S0950-0618(03)00043-6</w:t>
+        <w:t xml:space="preserve">(6–7), 447–462. https://doi.​org/​10.​1016/​S0950-0618(03)​00043-6</w:t>
       </w:r>
     </w:p>
     <w:p>
@@ -9676,7 +9676,7 @@
           <w:sz w:val="24"/>
           <w:szCs w:val="24"/>
         </w:rPr>
-        <w:t xml:space="preserve">, 116584. https://doi.org/10.1016/j.cma.2023.116584</w:t>
+        <w:t xml:space="preserve">, 116584. https://doi.​org/​10.​1016/​j.​cma.​2023.​116584</w:t>
       </w:r>
     </w:p>
     <w:p>

</xml_diff>

<commit_message>
Drop 'after Review 2' wording from report and READMEs
Co-Authored-By: Claude Opus 5.5 <noreply@anthropic.com>
Claude-Session: https://claude.ai/code/session_014cHUjWVW99MgkXsaKBnv5R
</commit_message>
<xml_diff>
--- a/11_part1_report/StrucIQ_Project_Part1_Report.docx
+++ b/11_part1_report/StrucIQ_Project_Part1_Report.docx
@@ -5126,7 +5126,7 @@
         <w:jc w:val="both"/>
       </w:pPr>
       <w:r>
-        <w:t xml:space="preserve">After Review 2, the model of Step 2 was applied to 10,000 beams covering the range of simply supported beams found in buildings. Each beam was taken through five damage stages, given simulated instrument readings and two benchmark tasks, and extended with strengthening, corrosion, sustained-load and fatigue stages; 40 beams were reanalysed with a continuum model as a cross-check. The dataset is published on Zenodo (Pesaru et al., 2026a); its design ranges and procedure are given in the Annexure (Tables A-1 to A-3). The code of every step, the processing scripts and the source files of this report are kept in a public GitHub repository (Pesaru et al., 2026b).</w:t>
+        <w:t xml:space="preserve">The model of Step 2 was then applied to 10,000 beams covering the range of simply supported beams found in buildings. Each beam was taken through five damage stages, given simulated instrument readings and two benchmark tasks, and extended with strengthening, corrosion, sustained-load and fatigue stages; 40 beams were reanalysed with a continuum model as a cross-check. The dataset is published on Zenodo (Pesaru et al., 2026a); its design ranges and procedure are given in the Annexure (Tables A-1 to A-3). The code of every step, the processing scripts and the source files of this report are kept in a public GitHub repository (Pesaru et al., 2026b).</w:t>
       </w:r>
     </w:p>
     <w:p>
@@ -8027,7 +8027,7 @@
         <w:jc w:val="both"/>
       </w:pPr>
       <w:r>
-        <w:t xml:space="preserve">Part 1 is complete: the beam model, the 300-beam Monte Carlo simulation, the blind validation and the 10,000-beam retrofit simulation were presented at Review 2 on 14 October 2026. After Review 2, the model was extended to the 10,000-beam design-space dataset with strengthening, corrosion, sustained-load and fatigue stages; the dataset was published on Zenodo and a research article was submitted (Chapter 7). All code and results are maintained in the project repository (Pesaru et al., 2026b). Part 2 covers specimen casting, sensor installation and live monitoring, damage and failure tests, and validation of the twin on our own beams (Figure 7).</w:t>
+        <w:t xml:space="preserve">Part 1 is complete: the beam model, the 300-beam Monte Carlo simulation, the blind validation and the 10,000-beam retrofit simulation were presented at Review 2 on 14 October 2026. Since then, the model has been extended to the 10,000-beam design-space dataset with strengthening, corrosion, sustained-load and fatigue stages; the dataset has been published on Zenodo and a research article has been submitted (Chapter 7). All code and results are maintained in the project repository (Pesaru et al., 2026b). Part 2 covers specimen casting, sensor installation and live monitoring, damage and failure tests, and validation of the twin on our own beams (Figure 7).</w:t>
       </w:r>
     </w:p>
     <w:p>
@@ -9720,7 +9720,7 @@
         <w:jc w:val="both"/>
       </w:pPr>
       <w:r>
-        <w:t xml:space="preserve">After Review 2, the model of Step 2 was applied across the range of beams found in buildings to build an open dataset (Pesaru et al., 2026a). Ten thousand simply supported beams were sampled by Latin hypercube sampling, which spreads the samples evenly over all inputs at once (McKay et al., 1979), within the ranges of Table A-1. Each beam was taken through five damage stages at 0.43, 0.62, 0.80, 0.89 and 1.00 times its hand-calculated first-yield load. After each stage it was unloaded and given a diagnostic and a service load cycle, and its first three frequencies, residual deflection, steel stress and strain, neutral axis depth and crack width (IS 456:2000 Annex F) were recorded; a final push to span/100 gave the peak load and the load-deflection curve.</w:t>
+        <w:t xml:space="preserve">The model of Step 2 was applied across the range of beams found in buildings to build an open dataset (Pesaru et al., 2026a). Ten thousand simply supported beams were sampled by Latin hypercube sampling, which spreads the samples evenly over all inputs at once (McKay et al., 1979), within the ranges of Table A-1. Each beam was taken through five damage stages at 0.43, 0.62, 0.80, 0.89 and 1.00 times its hand-calculated first-yield load. After each stage it was unloaded and given a diagnostic and a service load cycle, and its first three frequencies, residual deflection, steel stress and strain, neutral axis depth and crack width (IS 456:2000 Annex F) were recorded; a final push to span/100 gave the peak load and the load-deflection curve.</w:t>
       </w:r>
     </w:p>
     <w:p>

</xml_diff>

<commit_message>
Part 1 report: add planned instrumentation (Annexure, Table A-6)
Co-Authored-By: Claude Opus 5.5 <noreply@anthropic.com>
Claude-Session: https://claude.ai/code/session_014cHUjWVW99MgkXsaKBnv5R
</commit_message>
<xml_diff>
--- a/11_part1_report/StrucIQ_Project_Part1_Report.docx
+++ b/11_part1_report/StrucIQ_Project_Part1_Report.docx
@@ -2019,6 +2019,24 @@
       </w:r>
     </w:p>
     <w:p>
+      <w:pPr>
+        <w:tabs>
+          <w:tab w:val="right" w:pos="9026" w:leader="dot"/>
+        </w:tabs>
+        <w:spacing w:after="0" w:line="360"/>
+      </w:pPr>
+      <w:r>
+        <w:rPr>
+          <w:b/>
+          <w:bCs/>
+        </w:rPr>
+        <w:t xml:space="preserve">Table A-6. </w:t>
+      </w:r>
+      <w:r>
+        <w:t xml:space="preserve">Planned Instrumentation of the Part 2 Beam Tests	18</w:t>
+      </w:r>
+    </w:p>
+    <w:p>
       <w:r>
         <w:br w:type="page"/>
       </w:r>
@@ -8027,7 +8045,7 @@
         <w:jc w:val="both"/>
       </w:pPr>
       <w:r>
-        <w:t xml:space="preserve">Part 1 is complete: the beam model, the 300-beam Monte Carlo simulation, the blind validation and the 10,000-beam retrofit simulation were presented at Review 2 on 14 October 2026. Since then, the model has been extended to the 10,000-beam design-space dataset with strengthening, corrosion, sustained-load and fatigue stages; the dataset has been published on Zenodo and a research article has been submitted (Chapter 7). All code and results are maintained in the project repository (Pesaru et al., 2026b). Part 2 covers specimen casting, sensor installation and live monitoring, damage and failure tests, and validation of the twin on our own beams (Figure 7).</w:t>
+        <w:t xml:space="preserve">Part 1 is complete: the beam model, the 300-beam Monte Carlo simulation, the blind validation and the 10,000-beam retrofit simulation were presented at Review 2 on 14 October 2026. Since then, the model has been extended to the 10,000-beam design-space dataset with strengthening, corrosion, sustained-load and fatigue stages; the dataset has been published on Zenodo and a research article has been submitted (Chapter 7). All code and results are maintained in the project repository (Pesaru et al., 2026b). Part 2 covers specimen casting, sensor installation and live monitoring (planned instrumentation in the Annexure, Table A-6), damage and failure tests, and validation of the twin on our own beams (Figure 7).</w:t>
       </w:r>
     </w:p>
     <w:p>
@@ -14470,6 +14488,1624 @@
         </w:tc>
       </w:tr>
     </w:tbl>
+    <w:p>
+      <w:pPr>
+        <w:pStyle w:val="Heading2"/>
+        <w:keepNext/>
+        <w:spacing w:after="80" w:before="200" w:line="300"/>
+      </w:pPr>
+      <w:r>
+        <w:rPr>
+          <w:rFonts w:ascii="Times New Roman" w:cs="Times New Roman" w:eastAsia="Times New Roman" w:hAnsi="Times New Roman"/>
+          <w:b/>
+          <w:bCs/>
+          <w:sz w:val="28"/>
+          <w:szCs w:val="28"/>
+        </w:rPr>
+        <w:t xml:space="preserve">Table A-6: Planned Instrumentation of the Part 2 Beam Tests</w:t>
+      </w:r>
+    </w:p>
+    <w:p>
+      <w:pPr>
+        <w:spacing w:after="100" w:before="0" w:line="360"/>
+        <w:jc w:val="both"/>
+      </w:pPr>
+      <w:r>
+        <w:t xml:space="preserve">The Part 2 beams are instrumented so that every reading the twin uses arrives automatically, with no manual entry. The sensors measure the same quantities as the simulated instrument readings of the dataset (load, deflection, acceleration, crack width and temperature), so the twin, which now runs on simulated readings, can switch to real readings without other changes. The instrumentation budget is about Rs. 20,000 to 30,000, so low-cost sensors are used, and the load is read from the load cell of the laboratory loading frame (Table A-6).</w:t>
+      </w:r>
+    </w:p>
+    <w:p>
+      <w:pPr>
+        <w:keepNext/>
+        <w:spacing w:after="60" w:before="120" w:line="276"/>
+        <w:jc w:val="center"/>
+      </w:pPr>
+      <w:r>
+        <w:rPr>
+          <w:b/>
+          <w:bCs/>
+          <w:sz w:val="24"/>
+          <w:szCs w:val="24"/>
+        </w:rPr>
+        <w:t xml:space="preserve">Table A-6.</w:t>
+      </w:r>
+      <w:r>
+        <w:rPr>
+          <w:sz w:val="24"/>
+          <w:szCs w:val="24"/>
+        </w:rPr>
+        <w:t xml:space="preserve"> Planned Instrumentation of the Part 2 Beam Tests</w:t>
+      </w:r>
+    </w:p>
+    <w:tbl>
+      <w:tblPr>
+        <w:tblW w:type="dxa" w:w="9026"/>
+        <w:jc w:val="center"/>
+        <w:tblBorders>
+          <w:top w:val="none" w:color="FFFFFF" w:sz="0"/>
+          <w:left w:val="none" w:color="FFFFFF" w:sz="0"/>
+          <w:bottom w:val="none" w:color="FFFFFF" w:sz="0"/>
+          <w:right w:val="none" w:color="FFFFFF" w:sz="0"/>
+          <w:insideH w:val="none" w:color="FFFFFF" w:sz="0"/>
+          <w:insideV w:val="none" w:color="FFFFFF" w:sz="0"/>
+        </w:tblBorders>
+      </w:tblPr>
+      <w:tblGrid>
+        <w:gridCol w:w="1650"/>
+        <w:gridCol w:w="2300"/>
+        <w:gridCol w:w="1700"/>
+        <w:gridCol w:w="1600"/>
+        <w:gridCol w:w="1776"/>
+      </w:tblGrid>
+      <w:tr>
+        <w:trPr>
+          <w:tblHeader/>
+        </w:trPr>
+        <w:tc>
+          <w:tcPr>
+            <w:tcW w:type="dxa" w:w="1650"/>
+            <w:tcBorders>
+              <w:top w:val="single" w:color="000000" w:sz="8"/>
+              <w:left w:val="none" w:color="FFFFFF" w:sz="0"/>
+              <w:bottom w:val="single" w:color="000000" w:sz="4"/>
+              <w:right w:val="none" w:color="FFFFFF" w:sz="0"/>
+            </w:tcBorders>
+            <w:tcMar>
+              <w:top w:type="dxa" w:w="60"/>
+              <w:left w:type="dxa" w:w="80"/>
+              <w:bottom w:type="dxa" w:w="60"/>
+              <w:right w:type="dxa" w:w="80"/>
+            </w:tcMar>
+            <w:vAlign w:val="center"/>
+          </w:tcPr>
+          <w:p>
+            <w:pPr>
+              <w:spacing w:after="0" w:line="240"/>
+              <w:jc w:val="center"/>
+            </w:pPr>
+            <w:r>
+              <w:rPr>
+                <w:b/>
+                <w:bCs/>
+                <w:sz w:val="22"/>
+                <w:szCs w:val="22"/>
+              </w:rPr>
+              <w:t xml:space="preserve">Quantity</w:t>
+            </w:r>
+          </w:p>
+        </w:tc>
+        <w:tc>
+          <w:tcPr>
+            <w:tcW w:type="dxa" w:w="2300"/>
+            <w:tcBorders>
+              <w:top w:val="single" w:color="000000" w:sz="8"/>
+              <w:left w:val="none" w:color="FFFFFF" w:sz="0"/>
+              <w:bottom w:val="single" w:color="000000" w:sz="4"/>
+              <w:right w:val="none" w:color="FFFFFF" w:sz="0"/>
+            </w:tcBorders>
+            <w:tcMar>
+              <w:top w:type="dxa" w:w="60"/>
+              <w:left w:type="dxa" w:w="80"/>
+              <w:bottom w:type="dxa" w:w="60"/>
+              <w:right w:type="dxa" w:w="80"/>
+            </w:tcMar>
+            <w:vAlign w:val="center"/>
+          </w:tcPr>
+          <w:p>
+            <w:pPr>
+              <w:spacing w:after="0" w:line="240"/>
+              <w:jc w:val="center"/>
+            </w:pPr>
+            <w:r>
+              <w:rPr>
+                <w:b/>
+                <w:bCs/>
+                <w:sz w:val="22"/>
+                <w:szCs w:val="22"/>
+              </w:rPr>
+              <w:t xml:space="preserve">Sensor</w:t>
+            </w:r>
+          </w:p>
+        </w:tc>
+        <w:tc>
+          <w:tcPr>
+            <w:tcW w:type="dxa" w:w="1700"/>
+            <w:tcBorders>
+              <w:top w:val="single" w:color="000000" w:sz="8"/>
+              <w:left w:val="none" w:color="FFFFFF" w:sz="0"/>
+              <w:bottom w:val="single" w:color="000000" w:sz="4"/>
+              <w:right w:val="none" w:color="FFFFFF" w:sz="0"/>
+            </w:tcBorders>
+            <w:tcMar>
+              <w:top w:type="dxa" w:w="60"/>
+              <w:left w:type="dxa" w:w="80"/>
+              <w:bottom w:type="dxa" w:w="60"/>
+              <w:right w:type="dxa" w:w="80"/>
+            </w:tcMar>
+            <w:vAlign w:val="center"/>
+          </w:tcPr>
+          <w:p>
+            <w:pPr>
+              <w:spacing w:after="0" w:line="240"/>
+              <w:jc w:val="center"/>
+            </w:pPr>
+            <w:r>
+              <w:rPr>
+                <w:b/>
+                <w:bCs/>
+                <w:sz w:val="22"/>
+                <w:szCs w:val="22"/>
+              </w:rPr>
+              <w:t xml:space="preserve">Location</w:t>
+            </w:r>
+          </w:p>
+        </w:tc>
+        <w:tc>
+          <w:tcPr>
+            <w:tcW w:type="dxa" w:w="1600"/>
+            <w:tcBorders>
+              <w:top w:val="single" w:color="000000" w:sz="8"/>
+              <w:left w:val="none" w:color="FFFFFF" w:sz="0"/>
+              <w:bottom w:val="single" w:color="000000" w:sz="4"/>
+              <w:right w:val="none" w:color="FFFFFF" w:sz="0"/>
+            </w:tcBorders>
+            <w:tcMar>
+              <w:top w:type="dxa" w:w="60"/>
+              <w:left w:type="dxa" w:w="80"/>
+              <w:bottom w:type="dxa" w:w="60"/>
+              <w:right w:type="dxa" w:w="80"/>
+            </w:tcMar>
+            <w:vAlign w:val="center"/>
+          </w:tcPr>
+          <w:p>
+            <w:pPr>
+              <w:spacing w:after="0" w:line="240"/>
+              <w:jc w:val="center"/>
+            </w:pPr>
+            <w:r>
+              <w:rPr>
+                <w:b/>
+                <w:bCs/>
+                <w:sz w:val="22"/>
+                <w:szCs w:val="22"/>
+              </w:rPr>
+              <w:t xml:space="preserve">Requirement</w:t>
+            </w:r>
+          </w:p>
+        </w:tc>
+        <w:tc>
+          <w:tcPr>
+            <w:tcW w:type="dxa" w:w="1776"/>
+            <w:tcBorders>
+              <w:top w:val="single" w:color="000000" w:sz="8"/>
+              <w:left w:val="none" w:color="FFFFFF" w:sz="0"/>
+              <w:bottom w:val="single" w:color="000000" w:sz="4"/>
+              <w:right w:val="none" w:color="FFFFFF" w:sz="0"/>
+            </w:tcBorders>
+            <w:tcMar>
+              <w:top w:type="dxa" w:w="60"/>
+              <w:left w:type="dxa" w:w="80"/>
+              <w:bottom w:type="dxa" w:w="60"/>
+              <w:right w:type="dxa" w:w="80"/>
+            </w:tcMar>
+            <w:vAlign w:val="center"/>
+          </w:tcPr>
+          <w:p>
+            <w:pPr>
+              <w:spacing w:after="0" w:line="240"/>
+              <w:jc w:val="center"/>
+            </w:pPr>
+            <w:r>
+              <w:rPr>
+                <w:b/>
+                <w:bCs/>
+                <w:sz w:val="22"/>
+                <w:szCs w:val="22"/>
+              </w:rPr>
+              <w:t xml:space="preserve">Use in the twin</w:t>
+            </w:r>
+          </w:p>
+        </w:tc>
+      </w:tr>
+      <w:tr>
+        <w:trPr>
+          <w:cantSplit/>
+        </w:trPr>
+        <w:tc>
+          <w:tcPr>
+            <w:tcW w:type="dxa" w:w="1650"/>
+            <w:tcBorders>
+              <w:top w:val="none" w:color="FFFFFF" w:sz="0"/>
+              <w:left w:val="none" w:color="FFFFFF" w:sz="0"/>
+              <w:bottom w:val="none" w:color="FFFFFF" w:sz="0"/>
+              <w:right w:val="none" w:color="FFFFFF" w:sz="0"/>
+            </w:tcBorders>
+            <w:tcMar>
+              <w:top w:type="dxa" w:w="60"/>
+              <w:left w:type="dxa" w:w="80"/>
+              <w:bottom w:type="dxa" w:w="60"/>
+              <w:right w:type="dxa" w:w="80"/>
+            </w:tcMar>
+            <w:vAlign w:val="center"/>
+          </w:tcPr>
+          <w:p>
+            <w:pPr>
+              <w:spacing w:after="0" w:line="240"/>
+              <w:jc w:val="center"/>
+            </w:pPr>
+            <w:r>
+              <w:rPr>
+                <w:b/>
+                <w:bCs/>
+                <w:sz w:val="22"/>
+                <w:szCs w:val="22"/>
+              </w:rPr>
+              <w:t xml:space="preserve">Load</w:t>
+            </w:r>
+          </w:p>
+        </w:tc>
+        <w:tc>
+          <w:tcPr>
+            <w:tcW w:type="dxa" w:w="2300"/>
+            <w:tcBorders>
+              <w:top w:val="none" w:color="FFFFFF" w:sz="0"/>
+              <w:left w:val="none" w:color="FFFFFF" w:sz="0"/>
+              <w:bottom w:val="none" w:color="FFFFFF" w:sz="0"/>
+              <w:right w:val="none" w:color="FFFFFF" w:sz="0"/>
+            </w:tcBorders>
+            <w:tcMar>
+              <w:top w:type="dxa" w:w="60"/>
+              <w:left w:type="dxa" w:w="80"/>
+              <w:bottom w:type="dxa" w:w="60"/>
+              <w:right w:type="dxa" w:w="80"/>
+            </w:tcMar>
+            <w:vAlign w:val="center"/>
+          </w:tcPr>
+          <w:p>
+            <w:pPr>
+              <w:spacing w:after="0" w:line="240"/>
+              <w:jc w:val="left"/>
+            </w:pPr>
+            <w:r>
+              <w:rPr>
+                <w:b w:val="false"/>
+                <w:bCs w:val="false"/>
+                <w:sz w:val="22"/>
+                <w:szCs w:val="22"/>
+              </w:rPr>
+              <w:t xml:space="preserve">Load cell of the servo-hydraulic loading frame, through a steel spreader beam</w:t>
+            </w:r>
+          </w:p>
+        </w:tc>
+        <w:tc>
+          <w:tcPr>
+            <w:tcW w:type="dxa" w:w="1700"/>
+            <w:tcBorders>
+              <w:top w:val="none" w:color="FFFFFF" w:sz="0"/>
+              <w:left w:val="none" w:color="FFFFFF" w:sz="0"/>
+              <w:bottom w:val="none" w:color="FFFFFF" w:sz="0"/>
+              <w:right w:val="none" w:color="FFFFFF" w:sz="0"/>
+            </w:tcBorders>
+            <w:tcMar>
+              <w:top w:type="dxa" w:w="60"/>
+              <w:left w:type="dxa" w:w="80"/>
+              <w:bottom w:type="dxa" w:w="60"/>
+              <w:right w:type="dxa" w:w="80"/>
+            </w:tcMar>
+            <w:vAlign w:val="center"/>
+          </w:tcPr>
+          <w:p>
+            <w:pPr>
+              <w:spacing w:after="0" w:line="240"/>
+              <w:jc w:val="left"/>
+            </w:pPr>
+            <w:r>
+              <w:rPr>
+                <w:b w:val="false"/>
+                <w:bCs w:val="false"/>
+                <w:sz w:val="22"/>
+                <w:szCs w:val="22"/>
+              </w:rPr>
+              <w:t xml:space="preserve">Two equal loads at the third points</w:t>
+            </w:r>
+          </w:p>
+        </w:tc>
+        <w:tc>
+          <w:tcPr>
+            <w:tcW w:type="dxa" w:w="1600"/>
+            <w:tcBorders>
+              <w:top w:val="none" w:color="FFFFFF" w:sz="0"/>
+              <w:left w:val="none" w:color="FFFFFF" w:sz="0"/>
+              <w:bottom w:val="none" w:color="FFFFFF" w:sz="0"/>
+              <w:right w:val="none" w:color="FFFFFF" w:sz="0"/>
+            </w:tcBorders>
+            <w:tcMar>
+              <w:top w:type="dxa" w:w="60"/>
+              <w:left w:type="dxa" w:w="80"/>
+              <w:bottom w:type="dxa" w:w="60"/>
+              <w:right w:type="dxa" w:w="80"/>
+            </w:tcMar>
+            <w:vAlign w:val="center"/>
+          </w:tcPr>
+          <w:p>
+            <w:pPr>
+              <w:spacing w:after="0" w:line="240"/>
+              <w:jc w:val="left"/>
+            </w:pPr>
+            <w:r>
+              <w:rPr>
+                <w:b w:val="false"/>
+                <w:bCs w:val="false"/>
+                <w:sz w:val="22"/>
+                <w:szCs w:val="22"/>
+              </w:rPr>
+              <w:t xml:space="preserve">0.1 kN</w:t>
+            </w:r>
+          </w:p>
+        </w:tc>
+        <w:tc>
+          <w:tcPr>
+            <w:tcW w:type="dxa" w:w="1776"/>
+            <w:tcBorders>
+              <w:top w:val="none" w:color="FFFFFF" w:sz="0"/>
+              <w:left w:val="none" w:color="FFFFFF" w:sz="0"/>
+              <w:bottom w:val="none" w:color="FFFFFF" w:sz="0"/>
+              <w:right w:val="none" w:color="FFFFFF" w:sz="0"/>
+            </w:tcBorders>
+            <w:tcMar>
+              <w:top w:type="dxa" w:w="60"/>
+              <w:left w:type="dxa" w:w="80"/>
+              <w:bottom w:type="dxa" w:w="60"/>
+              <w:right w:type="dxa" w:w="80"/>
+            </w:tcMar>
+            <w:vAlign w:val="center"/>
+          </w:tcPr>
+          <w:p>
+            <w:pPr>
+              <w:spacing w:after="0" w:line="240"/>
+              <w:jc w:val="left"/>
+            </w:pPr>
+            <w:r>
+              <w:rPr>
+                <w:b w:val="false"/>
+                <w:bCs w:val="false"/>
+                <w:sz w:val="22"/>
+                <w:szCs w:val="22"/>
+              </w:rPr>
+              <w:t xml:space="preserve">Stage loads; stiffness from load and deflection</w:t>
+            </w:r>
+          </w:p>
+        </w:tc>
+      </w:tr>
+      <w:tr>
+        <w:trPr>
+          <w:cantSplit/>
+        </w:trPr>
+        <w:tc>
+          <w:tcPr>
+            <w:tcW w:type="dxa" w:w="1650"/>
+            <w:tcBorders>
+              <w:top w:val="none" w:color="FFFFFF" w:sz="0"/>
+              <w:left w:val="none" w:color="FFFFFF" w:sz="0"/>
+              <w:bottom w:val="none" w:color="FFFFFF" w:sz="0"/>
+              <w:right w:val="none" w:color="FFFFFF" w:sz="0"/>
+            </w:tcBorders>
+            <w:tcMar>
+              <w:top w:type="dxa" w:w="60"/>
+              <w:left w:type="dxa" w:w="80"/>
+              <w:bottom w:type="dxa" w:w="60"/>
+              <w:right w:type="dxa" w:w="80"/>
+            </w:tcMar>
+            <w:vAlign w:val="center"/>
+          </w:tcPr>
+          <w:p>
+            <w:pPr>
+              <w:spacing w:after="0" w:line="240"/>
+              <w:jc w:val="center"/>
+            </w:pPr>
+            <w:r>
+              <w:rPr>
+                <w:b/>
+                <w:bCs/>
+                <w:sz w:val="22"/>
+                <w:szCs w:val="22"/>
+              </w:rPr>
+              <w:t xml:space="preserve">Midspan deflection</w:t>
+            </w:r>
+          </w:p>
+        </w:tc>
+        <w:tc>
+          <w:tcPr>
+            <w:tcW w:type="dxa" w:w="2300"/>
+            <w:tcBorders>
+              <w:top w:val="none" w:color="FFFFFF" w:sz="0"/>
+              <w:left w:val="none" w:color="FFFFFF" w:sz="0"/>
+              <w:bottom w:val="none" w:color="FFFFFF" w:sz="0"/>
+              <w:right w:val="none" w:color="FFFFFF" w:sz="0"/>
+            </w:tcBorders>
+            <w:tcMar>
+              <w:top w:type="dxa" w:w="60"/>
+              <w:left w:type="dxa" w:w="80"/>
+              <w:bottom w:type="dxa" w:w="60"/>
+              <w:right w:type="dxa" w:w="80"/>
+            </w:tcMar>
+            <w:vAlign w:val="center"/>
+          </w:tcPr>
+          <w:p>
+            <w:pPr>
+              <w:spacing w:after="0" w:line="240"/>
+              <w:jc w:val="left"/>
+            </w:pPr>
+            <w:r>
+              <w:rPr>
+                <w:b w:val="false"/>
+                <w:bCs w:val="false"/>
+                <w:sz w:val="22"/>
+                <w:szCs w:val="22"/>
+              </w:rPr>
+              <w:t xml:space="preserve">Displacement sensor (linear potentiometer or linear variable differential transformer)</w:t>
+            </w:r>
+          </w:p>
+        </w:tc>
+        <w:tc>
+          <w:tcPr>
+            <w:tcW w:type="dxa" w:w="1700"/>
+            <w:tcBorders>
+              <w:top w:val="none" w:color="FFFFFF" w:sz="0"/>
+              <w:left w:val="none" w:color="FFFFFF" w:sz="0"/>
+              <w:bottom w:val="none" w:color="FFFFFF" w:sz="0"/>
+              <w:right w:val="none" w:color="FFFFFF" w:sz="0"/>
+            </w:tcBorders>
+            <w:tcMar>
+              <w:top w:type="dxa" w:w="60"/>
+              <w:left w:type="dxa" w:w="80"/>
+              <w:bottom w:type="dxa" w:w="60"/>
+              <w:right w:type="dxa" w:w="80"/>
+            </w:tcMar>
+            <w:vAlign w:val="center"/>
+          </w:tcPr>
+          <w:p>
+            <w:pPr>
+              <w:spacing w:after="0" w:line="240"/>
+              <w:jc w:val="left"/>
+            </w:pPr>
+            <w:r>
+              <w:rPr>
+                <w:b w:val="false"/>
+                <w:bCs w:val="false"/>
+                <w:sz w:val="22"/>
+                <w:szCs w:val="22"/>
+              </w:rPr>
+              <w:t xml:space="preserve">Soffit at midspan</w:t>
+            </w:r>
+          </w:p>
+        </w:tc>
+        <w:tc>
+          <w:tcPr>
+            <w:tcW w:type="dxa" w:w="1600"/>
+            <w:tcBorders>
+              <w:top w:val="none" w:color="FFFFFF" w:sz="0"/>
+              <w:left w:val="none" w:color="FFFFFF" w:sz="0"/>
+              <w:bottom w:val="none" w:color="FFFFFF" w:sz="0"/>
+              <w:right w:val="none" w:color="FFFFFF" w:sz="0"/>
+            </w:tcBorders>
+            <w:tcMar>
+              <w:top w:type="dxa" w:w="60"/>
+              <w:left w:type="dxa" w:w="80"/>
+              <w:bottom w:type="dxa" w:w="60"/>
+              <w:right w:type="dxa" w:w="80"/>
+            </w:tcMar>
+            <w:vAlign w:val="center"/>
+          </w:tcPr>
+          <w:p>
+            <w:pPr>
+              <w:spacing w:after="0" w:line="240"/>
+              <w:jc w:val="left"/>
+            </w:pPr>
+            <w:r>
+              <w:rPr>
+                <w:b w:val="false"/>
+                <w:bCs w:val="false"/>
+                <w:sz w:val="22"/>
+                <w:szCs w:val="22"/>
+              </w:rPr>
+              <w:t xml:space="preserve">0.01 mm</w:t>
+            </w:r>
+          </w:p>
+        </w:tc>
+        <w:tc>
+          <w:tcPr>
+            <w:tcW w:type="dxa" w:w="1776"/>
+            <w:tcBorders>
+              <w:top w:val="none" w:color="FFFFFF" w:sz="0"/>
+              <w:left w:val="none" w:color="FFFFFF" w:sz="0"/>
+              <w:bottom w:val="none" w:color="FFFFFF" w:sz="0"/>
+              <w:right w:val="none" w:color="FFFFFF" w:sz="0"/>
+            </w:tcBorders>
+            <w:tcMar>
+              <w:top w:type="dxa" w:w="60"/>
+              <w:left w:type="dxa" w:w="80"/>
+              <w:bottom w:type="dxa" w:w="60"/>
+              <w:right w:type="dxa" w:w="80"/>
+            </w:tcMar>
+            <w:vAlign w:val="center"/>
+          </w:tcPr>
+          <w:p>
+            <w:pPr>
+              <w:spacing w:after="0" w:line="240"/>
+              <w:jc w:val="left"/>
+            </w:pPr>
+            <w:r>
+              <w:rPr>
+                <w:b w:val="false"/>
+                <w:bCs w:val="false"/>
+                <w:sz w:val="22"/>
+                <w:szCs w:val="22"/>
+              </w:rPr>
+              <w:t xml:space="preserve">Deflection stiffness; permanent set after unloading</w:t>
+            </w:r>
+          </w:p>
+        </w:tc>
+      </w:tr>
+      <w:tr>
+        <w:trPr>
+          <w:cantSplit/>
+        </w:trPr>
+        <w:tc>
+          <w:tcPr>
+            <w:tcW w:type="dxa" w:w="1650"/>
+            <w:tcBorders>
+              <w:top w:val="none" w:color="FFFFFF" w:sz="0"/>
+              <w:left w:val="none" w:color="FFFFFF" w:sz="0"/>
+              <w:bottom w:val="none" w:color="FFFFFF" w:sz="0"/>
+              <w:right w:val="none" w:color="FFFFFF" w:sz="0"/>
+            </w:tcBorders>
+            <w:tcMar>
+              <w:top w:type="dxa" w:w="60"/>
+              <w:left w:type="dxa" w:w="80"/>
+              <w:bottom w:type="dxa" w:w="60"/>
+              <w:right w:type="dxa" w:w="80"/>
+            </w:tcMar>
+            <w:vAlign w:val="center"/>
+          </w:tcPr>
+          <w:p>
+            <w:pPr>
+              <w:spacing w:after="0" w:line="240"/>
+              <w:jc w:val="center"/>
+            </w:pPr>
+            <w:r>
+              <w:rPr>
+                <w:b/>
+                <w:bCs/>
+                <w:sz w:val="22"/>
+                <w:szCs w:val="22"/>
+              </w:rPr>
+              <w:t xml:space="preserve">Support movement</w:t>
+            </w:r>
+          </w:p>
+        </w:tc>
+        <w:tc>
+          <w:tcPr>
+            <w:tcW w:type="dxa" w:w="2300"/>
+            <w:tcBorders>
+              <w:top w:val="none" w:color="FFFFFF" w:sz="0"/>
+              <w:left w:val="none" w:color="FFFFFF" w:sz="0"/>
+              <w:bottom w:val="none" w:color="FFFFFF" w:sz="0"/>
+              <w:right w:val="none" w:color="FFFFFF" w:sz="0"/>
+            </w:tcBorders>
+            <w:tcMar>
+              <w:top w:type="dxa" w:w="60"/>
+              <w:left w:type="dxa" w:w="80"/>
+              <w:bottom w:type="dxa" w:w="60"/>
+              <w:right w:type="dxa" w:w="80"/>
+            </w:tcMar>
+            <w:vAlign w:val="center"/>
+          </w:tcPr>
+          <w:p>
+            <w:pPr>
+              <w:spacing w:after="0" w:line="240"/>
+              <w:jc w:val="left"/>
+            </w:pPr>
+            <w:r>
+              <w:rPr>
+                <w:b w:val="false"/>
+                <w:bCs w:val="false"/>
+                <w:sz w:val="22"/>
+                <w:szCs w:val="22"/>
+              </w:rPr>
+              <w:t xml:space="preserve">Two displacement sensors</w:t>
+            </w:r>
+          </w:p>
+        </w:tc>
+        <w:tc>
+          <w:tcPr>
+            <w:tcW w:type="dxa" w:w="1700"/>
+            <w:tcBorders>
+              <w:top w:val="none" w:color="FFFFFF" w:sz="0"/>
+              <w:left w:val="none" w:color="FFFFFF" w:sz="0"/>
+              <w:bottom w:val="none" w:color="FFFFFF" w:sz="0"/>
+              <w:right w:val="none" w:color="FFFFFF" w:sz="0"/>
+            </w:tcBorders>
+            <w:tcMar>
+              <w:top w:type="dxa" w:w="60"/>
+              <w:left w:type="dxa" w:w="80"/>
+              <w:bottom w:type="dxa" w:w="60"/>
+              <w:right w:type="dxa" w:w="80"/>
+            </w:tcMar>
+            <w:vAlign w:val="center"/>
+          </w:tcPr>
+          <w:p>
+            <w:pPr>
+              <w:spacing w:after="0" w:line="240"/>
+              <w:jc w:val="left"/>
+            </w:pPr>
+            <w:r>
+              <w:rPr>
+                <w:b w:val="false"/>
+                <w:bCs w:val="false"/>
+                <w:sz w:val="22"/>
+                <w:szCs w:val="22"/>
+              </w:rPr>
+              <w:t xml:space="preserve">Over each support</w:t>
+            </w:r>
+          </w:p>
+        </w:tc>
+        <w:tc>
+          <w:tcPr>
+            <w:tcW w:type="dxa" w:w="1600"/>
+            <w:tcBorders>
+              <w:top w:val="none" w:color="FFFFFF" w:sz="0"/>
+              <w:left w:val="none" w:color="FFFFFF" w:sz="0"/>
+              <w:bottom w:val="none" w:color="FFFFFF" w:sz="0"/>
+              <w:right w:val="none" w:color="FFFFFF" w:sz="0"/>
+            </w:tcBorders>
+            <w:tcMar>
+              <w:top w:type="dxa" w:w="60"/>
+              <w:left w:type="dxa" w:w="80"/>
+              <w:bottom w:type="dxa" w:w="60"/>
+              <w:right w:type="dxa" w:w="80"/>
+            </w:tcMar>
+            <w:vAlign w:val="center"/>
+          </w:tcPr>
+          <w:p>
+            <w:pPr>
+              <w:spacing w:after="0" w:line="240"/>
+              <w:jc w:val="left"/>
+            </w:pPr>
+            <w:r>
+              <w:rPr>
+                <w:b w:val="false"/>
+                <w:bCs w:val="false"/>
+                <w:sz w:val="22"/>
+                <w:szCs w:val="22"/>
+              </w:rPr>
+              <w:t xml:space="preserve">0.01 mm</w:t>
+            </w:r>
+          </w:p>
+        </w:tc>
+        <w:tc>
+          <w:tcPr>
+            <w:tcW w:type="dxa" w:w="1776"/>
+            <w:tcBorders>
+              <w:top w:val="none" w:color="FFFFFF" w:sz="0"/>
+              <w:left w:val="none" w:color="FFFFFF" w:sz="0"/>
+              <w:bottom w:val="none" w:color="FFFFFF" w:sz="0"/>
+              <w:right w:val="none" w:color="FFFFFF" w:sz="0"/>
+            </w:tcBorders>
+            <w:tcMar>
+              <w:top w:type="dxa" w:w="60"/>
+              <w:left w:type="dxa" w:w="80"/>
+              <w:bottom w:type="dxa" w:w="60"/>
+              <w:right w:type="dxa" w:w="80"/>
+            </w:tcMar>
+            <w:vAlign w:val="center"/>
+          </w:tcPr>
+          <w:p>
+            <w:pPr>
+              <w:spacing w:after="0" w:line="240"/>
+              <w:jc w:val="left"/>
+            </w:pPr>
+            <w:r>
+              <w:rPr>
+                <w:b w:val="false"/>
+                <w:bCs w:val="false"/>
+                <w:sz w:val="22"/>
+                <w:szCs w:val="22"/>
+              </w:rPr>
+              <w:t xml:space="preserve">Removes support and setup movement from the midspan deflection</w:t>
+            </w:r>
+          </w:p>
+        </w:tc>
+      </w:tr>
+      <w:tr>
+        <w:trPr>
+          <w:cantSplit/>
+        </w:trPr>
+        <w:tc>
+          <w:tcPr>
+            <w:tcW w:type="dxa" w:w="1650"/>
+            <w:tcBorders>
+              <w:top w:val="none" w:color="FFFFFF" w:sz="0"/>
+              <w:left w:val="none" w:color="FFFFFF" w:sz="0"/>
+              <w:bottom w:val="none" w:color="FFFFFF" w:sz="0"/>
+              <w:right w:val="none" w:color="FFFFFF" w:sz="0"/>
+            </w:tcBorders>
+            <w:tcMar>
+              <w:top w:type="dxa" w:w="60"/>
+              <w:left w:type="dxa" w:w="80"/>
+              <w:bottom w:type="dxa" w:w="60"/>
+              <w:right w:type="dxa" w:w="80"/>
+            </w:tcMar>
+            <w:vAlign w:val="center"/>
+          </w:tcPr>
+          <w:p>
+            <w:pPr>
+              <w:spacing w:after="0" w:line="240"/>
+              <w:jc w:val="center"/>
+            </w:pPr>
+            <w:r>
+              <w:rPr>
+                <w:b/>
+                <w:bCs/>
+                <w:sz w:val="22"/>
+                <w:szCs w:val="22"/>
+              </w:rPr>
+              <w:t xml:space="preserve">Acceleration</w:t>
+            </w:r>
+          </w:p>
+        </w:tc>
+        <w:tc>
+          <w:tcPr>
+            <w:tcW w:type="dxa" w:w="2300"/>
+            <w:tcBorders>
+              <w:top w:val="none" w:color="FFFFFF" w:sz="0"/>
+              <w:left w:val="none" w:color="FFFFFF" w:sz="0"/>
+              <w:bottom w:val="none" w:color="FFFFFF" w:sz="0"/>
+              <w:right w:val="none" w:color="FFFFFF" w:sz="0"/>
+            </w:tcBorders>
+            <w:tcMar>
+              <w:top w:type="dxa" w:w="60"/>
+              <w:left w:type="dxa" w:w="80"/>
+              <w:bottom w:type="dxa" w:w="60"/>
+              <w:right w:type="dxa" w:w="80"/>
+            </w:tcMar>
+            <w:vAlign w:val="center"/>
+          </w:tcPr>
+          <w:p>
+            <w:pPr>
+              <w:spacing w:after="0" w:line="240"/>
+              <w:jc w:val="left"/>
+            </w:pPr>
+            <w:r>
+              <w:rPr>
+                <w:b w:val="false"/>
+                <w:bCs w:val="false"/>
+                <w:sz w:val="22"/>
+                <w:szCs w:val="22"/>
+              </w:rPr>
+              <w:t xml:space="preserve">Low-noise digital micro-electro-mechanical accelerometer (ADXL355 class)</w:t>
+            </w:r>
+          </w:p>
+        </w:tc>
+        <w:tc>
+          <w:tcPr>
+            <w:tcW w:type="dxa" w:w="1700"/>
+            <w:tcBorders>
+              <w:top w:val="none" w:color="FFFFFF" w:sz="0"/>
+              <w:left w:val="none" w:color="FFFFFF" w:sz="0"/>
+              <w:bottom w:val="none" w:color="FFFFFF" w:sz="0"/>
+              <w:right w:val="none" w:color="FFFFFF" w:sz="0"/>
+            </w:tcBorders>
+            <w:tcMar>
+              <w:top w:type="dxa" w:w="60"/>
+              <w:left w:type="dxa" w:w="80"/>
+              <w:bottom w:type="dxa" w:w="60"/>
+              <w:right w:type="dxa" w:w="80"/>
+            </w:tcMar>
+            <w:vAlign w:val="center"/>
+          </w:tcPr>
+          <w:p>
+            <w:pPr>
+              <w:spacing w:after="0" w:line="240"/>
+              <w:jc w:val="left"/>
+            </w:pPr>
+            <w:r>
+              <w:rPr>
+                <w:b w:val="false"/>
+                <w:bCs w:val="false"/>
+                <w:sz w:val="22"/>
+                <w:szCs w:val="22"/>
+              </w:rPr>
+              <w:t xml:space="preserve">Quarter span, away from the nodes of the first two modes</w:t>
+            </w:r>
+          </w:p>
+        </w:tc>
+        <w:tc>
+          <w:tcPr>
+            <w:tcW w:type="dxa" w:w="1600"/>
+            <w:tcBorders>
+              <w:top w:val="none" w:color="FFFFFF" w:sz="0"/>
+              <w:left w:val="none" w:color="FFFFFF" w:sz="0"/>
+              <w:bottom w:val="none" w:color="FFFFFF" w:sz="0"/>
+              <w:right w:val="none" w:color="FFFFFF" w:sz="0"/>
+            </w:tcBorders>
+            <w:tcMar>
+              <w:top w:type="dxa" w:w="60"/>
+              <w:left w:type="dxa" w:w="80"/>
+              <w:bottom w:type="dxa" w:w="60"/>
+              <w:right w:type="dxa" w:w="80"/>
+            </w:tcMar>
+            <w:vAlign w:val="center"/>
+          </w:tcPr>
+          <w:p>
+            <w:pPr>
+              <w:spacing w:after="0" w:line="240"/>
+              <w:jc w:val="left"/>
+            </w:pPr>
+            <w:r>
+              <w:rPr>
+                <w:b w:val="false"/>
+                <w:bCs w:val="false"/>
+                <w:sz w:val="22"/>
+                <w:szCs w:val="22"/>
+              </w:rPr>
+              <w:t xml:space="preserve">Sampling at 2,000 Hz or more (first frequency about 52 Hz)</w:t>
+            </w:r>
+          </w:p>
+        </w:tc>
+        <w:tc>
+          <w:tcPr>
+            <w:tcW w:type="dxa" w:w="1776"/>
+            <w:tcBorders>
+              <w:top w:val="none" w:color="FFFFFF" w:sz="0"/>
+              <w:left w:val="none" w:color="FFFFFF" w:sz="0"/>
+              <w:bottom w:val="none" w:color="FFFFFF" w:sz="0"/>
+              <w:right w:val="none" w:color="FFFFFF" w:sz="0"/>
+            </w:tcBorders>
+            <w:tcMar>
+              <w:top w:type="dxa" w:w="60"/>
+              <w:left w:type="dxa" w:w="80"/>
+              <w:bottom w:type="dxa" w:w="60"/>
+              <w:right w:type="dxa" w:w="80"/>
+            </w:tcMar>
+            <w:vAlign w:val="center"/>
+          </w:tcPr>
+          <w:p>
+            <w:pPr>
+              <w:spacing w:after="0" w:line="240"/>
+              <w:jc w:val="left"/>
+            </w:pPr>
+            <w:r>
+              <w:rPr>
+                <w:b w:val="false"/>
+                <w:bCs w:val="false"/>
+                <w:sz w:val="22"/>
+                <w:szCs w:val="22"/>
+              </w:rPr>
+              <w:t xml:space="preserve">Natural frequency after each damage stage</w:t>
+            </w:r>
+          </w:p>
+        </w:tc>
+      </w:tr>
+      <w:tr>
+        <w:trPr>
+          <w:cantSplit/>
+        </w:trPr>
+        <w:tc>
+          <w:tcPr>
+            <w:tcW w:type="dxa" w:w="1650"/>
+            <w:tcBorders>
+              <w:top w:val="none" w:color="FFFFFF" w:sz="0"/>
+              <w:left w:val="none" w:color="FFFFFF" w:sz="0"/>
+              <w:bottom w:val="none" w:color="FFFFFF" w:sz="0"/>
+              <w:right w:val="none" w:color="FFFFFF" w:sz="0"/>
+            </w:tcBorders>
+            <w:tcMar>
+              <w:top w:type="dxa" w:w="60"/>
+              <w:left w:type="dxa" w:w="80"/>
+              <w:bottom w:type="dxa" w:w="60"/>
+              <w:right w:type="dxa" w:w="80"/>
+            </w:tcMar>
+            <w:vAlign w:val="center"/>
+          </w:tcPr>
+          <w:p>
+            <w:pPr>
+              <w:spacing w:after="0" w:line="240"/>
+              <w:jc w:val="center"/>
+            </w:pPr>
+            <w:r>
+              <w:rPr>
+                <w:b/>
+                <w:bCs/>
+                <w:sz w:val="22"/>
+                <w:szCs w:val="22"/>
+              </w:rPr>
+              <w:t xml:space="preserve">Excitation</w:t>
+            </w:r>
+          </w:p>
+        </w:tc>
+        <w:tc>
+          <w:tcPr>
+            <w:tcW w:type="dxa" w:w="2300"/>
+            <w:tcBorders>
+              <w:top w:val="none" w:color="FFFFFF" w:sz="0"/>
+              <w:left w:val="none" w:color="FFFFFF" w:sz="0"/>
+              <w:bottom w:val="none" w:color="FFFFFF" w:sz="0"/>
+              <w:right w:val="none" w:color="FFFFFF" w:sz="0"/>
+            </w:tcBorders>
+            <w:tcMar>
+              <w:top w:type="dxa" w:w="60"/>
+              <w:left w:type="dxa" w:w="80"/>
+              <w:bottom w:type="dxa" w:w="60"/>
+              <w:right w:type="dxa" w:w="80"/>
+            </w:tcMar>
+            <w:vAlign w:val="center"/>
+          </w:tcPr>
+          <w:p>
+            <w:pPr>
+              <w:spacing w:after="0" w:line="240"/>
+              <w:jc w:val="left"/>
+            </w:pPr>
+            <w:r>
+              <w:rPr>
+                <w:b w:val="false"/>
+                <w:bCs w:val="false"/>
+                <w:sz w:val="22"/>
+                <w:szCs w:val="22"/>
+              </w:rPr>
+              <w:t xml:space="preserve">Automatic tapper driven by the microcontroller</w:t>
+            </w:r>
+          </w:p>
+        </w:tc>
+        <w:tc>
+          <w:tcPr>
+            <w:tcW w:type="dxa" w:w="1700"/>
+            <w:tcBorders>
+              <w:top w:val="none" w:color="FFFFFF" w:sz="0"/>
+              <w:left w:val="none" w:color="FFFFFF" w:sz="0"/>
+              <w:bottom w:val="none" w:color="FFFFFF" w:sz="0"/>
+              <w:right w:val="none" w:color="FFFFFF" w:sz="0"/>
+            </w:tcBorders>
+            <w:tcMar>
+              <w:top w:type="dxa" w:w="60"/>
+              <w:left w:type="dxa" w:w="80"/>
+              <w:bottom w:type="dxa" w:w="60"/>
+              <w:right w:type="dxa" w:w="80"/>
+            </w:tcMar>
+            <w:vAlign w:val="center"/>
+          </w:tcPr>
+          <w:p>
+            <w:pPr>
+              <w:spacing w:after="0" w:line="240"/>
+              <w:jc w:val="left"/>
+            </w:pPr>
+            <w:r>
+              <w:rPr>
+                <w:b w:val="false"/>
+                <w:bCs w:val="false"/>
+                <w:sz w:val="22"/>
+                <w:szCs w:val="22"/>
+              </w:rPr>
+              <w:t xml:space="preserve">Marked point on the top face</w:t>
+            </w:r>
+          </w:p>
+        </w:tc>
+        <w:tc>
+          <w:tcPr>
+            <w:tcW w:type="dxa" w:w="1600"/>
+            <w:tcBorders>
+              <w:top w:val="none" w:color="FFFFFF" w:sz="0"/>
+              <w:left w:val="none" w:color="FFFFFF" w:sz="0"/>
+              <w:bottom w:val="none" w:color="FFFFFF" w:sz="0"/>
+              <w:right w:val="none" w:color="FFFFFF" w:sz="0"/>
+            </w:tcBorders>
+            <w:tcMar>
+              <w:top w:type="dxa" w:w="60"/>
+              <w:left w:type="dxa" w:w="80"/>
+              <w:bottom w:type="dxa" w:w="60"/>
+              <w:right w:type="dxa" w:w="80"/>
+            </w:tcMar>
+            <w:vAlign w:val="center"/>
+          </w:tcPr>
+          <w:p>
+            <w:pPr>
+              <w:spacing w:after="0" w:line="240"/>
+              <w:jc w:val="left"/>
+            </w:pPr>
+            <w:r>
+              <w:rPr>
+                <w:b w:val="false"/>
+                <w:bCs w:val="false"/>
+                <w:sz w:val="22"/>
+                <w:szCs w:val="22"/>
+              </w:rPr>
+              <w:t xml:space="preserve">Same tap in every test</w:t>
+            </w:r>
+          </w:p>
+        </w:tc>
+        <w:tc>
+          <w:tcPr>
+            <w:tcW w:type="dxa" w:w="1776"/>
+            <w:tcBorders>
+              <w:top w:val="none" w:color="FFFFFF" w:sz="0"/>
+              <w:left w:val="none" w:color="FFFFFF" w:sz="0"/>
+              <w:bottom w:val="none" w:color="FFFFFF" w:sz="0"/>
+              <w:right w:val="none" w:color="FFFFFF" w:sz="0"/>
+            </w:tcBorders>
+            <w:tcMar>
+              <w:top w:type="dxa" w:w="60"/>
+              <w:left w:type="dxa" w:w="80"/>
+              <w:bottom w:type="dxa" w:w="60"/>
+              <w:right w:type="dxa" w:w="80"/>
+            </w:tcMar>
+            <w:vAlign w:val="center"/>
+          </w:tcPr>
+          <w:p>
+            <w:pPr>
+              <w:spacing w:after="0" w:line="240"/>
+              <w:jc w:val="left"/>
+            </w:pPr>
+            <w:r>
+              <w:rPr>
+                <w:b w:val="false"/>
+                <w:bCs w:val="false"/>
+                <w:sz w:val="22"/>
+                <w:szCs w:val="22"/>
+              </w:rPr>
+              <w:t xml:space="preserve">Repeatable free vibration</w:t>
+            </w:r>
+          </w:p>
+        </w:tc>
+      </w:tr>
+      <w:tr>
+        <w:trPr>
+          <w:cantSplit/>
+        </w:trPr>
+        <w:tc>
+          <w:tcPr>
+            <w:tcW w:type="dxa" w:w="1650"/>
+            <w:tcBorders>
+              <w:top w:val="none" w:color="FFFFFF" w:sz="0"/>
+              <w:left w:val="none" w:color="FFFFFF" w:sz="0"/>
+              <w:bottom w:val="none" w:color="FFFFFF" w:sz="0"/>
+              <w:right w:val="none" w:color="FFFFFF" w:sz="0"/>
+            </w:tcBorders>
+            <w:tcMar>
+              <w:top w:type="dxa" w:w="60"/>
+              <w:left w:type="dxa" w:w="80"/>
+              <w:bottom w:type="dxa" w:w="60"/>
+              <w:right w:type="dxa" w:w="80"/>
+            </w:tcMar>
+            <w:vAlign w:val="center"/>
+          </w:tcPr>
+          <w:p>
+            <w:pPr>
+              <w:spacing w:after="0" w:line="240"/>
+              <w:jc w:val="center"/>
+            </w:pPr>
+            <w:r>
+              <w:rPr>
+                <w:b/>
+                <w:bCs/>
+                <w:sz w:val="22"/>
+                <w:szCs w:val="22"/>
+              </w:rPr>
+              <w:t xml:space="preserve">Crack width</w:t>
+            </w:r>
+          </w:p>
+        </w:tc>
+        <w:tc>
+          <w:tcPr>
+            <w:tcW w:type="dxa" w:w="2300"/>
+            <w:tcBorders>
+              <w:top w:val="none" w:color="FFFFFF" w:sz="0"/>
+              <w:left w:val="none" w:color="FFFFFF" w:sz="0"/>
+              <w:bottom w:val="none" w:color="FFFFFF" w:sz="0"/>
+              <w:right w:val="none" w:color="FFFFFF" w:sz="0"/>
+            </w:tcBorders>
+            <w:tcMar>
+              <w:top w:type="dxa" w:w="60"/>
+              <w:left w:type="dxa" w:w="80"/>
+              <w:bottom w:type="dxa" w:w="60"/>
+              <w:right w:type="dxa" w:w="80"/>
+            </w:tcMar>
+            <w:vAlign w:val="center"/>
+          </w:tcPr>
+          <w:p>
+            <w:pPr>
+              <w:spacing w:after="0" w:line="240"/>
+              <w:jc w:val="left"/>
+            </w:pPr>
+            <w:r>
+              <w:rPr>
+                <w:b w:val="false"/>
+                <w:bCs w:val="false"/>
+                <w:sz w:val="22"/>
+                <w:szCs w:val="22"/>
+              </w:rPr>
+              <w:t xml:space="preserve">Camera (5-megapixel ESP32 camera board, upgraded if the pilot test needs it) on a motorised rail, with printed scale markers</w:t>
+            </w:r>
+          </w:p>
+        </w:tc>
+        <w:tc>
+          <w:tcPr>
+            <w:tcW w:type="dxa" w:w="1700"/>
+            <w:tcBorders>
+              <w:top w:val="none" w:color="FFFFFF" w:sz="0"/>
+              <w:left w:val="none" w:color="FFFFFF" w:sz="0"/>
+              <w:bottom w:val="none" w:color="FFFFFF" w:sz="0"/>
+              <w:right w:val="none" w:color="FFFFFF" w:sz="0"/>
+            </w:tcBorders>
+            <w:tcMar>
+              <w:top w:type="dxa" w:w="60"/>
+              <w:left w:type="dxa" w:w="80"/>
+              <w:bottom w:type="dxa" w:w="60"/>
+              <w:right w:type="dxa" w:w="80"/>
+            </w:tcMar>
+            <w:vAlign w:val="center"/>
+          </w:tcPr>
+          <w:p>
+            <w:pPr>
+              <w:spacing w:after="0" w:line="240"/>
+              <w:jc w:val="left"/>
+            </w:pPr>
+            <w:r>
+              <w:rPr>
+                <w:b w:val="false"/>
+                <w:bCs w:val="false"/>
+                <w:sz w:val="22"/>
+                <w:szCs w:val="22"/>
+              </w:rPr>
+              <w:t xml:space="preserve">Bottom strip of the front face along the constant-moment zone</w:t>
+            </w:r>
+          </w:p>
+        </w:tc>
+        <w:tc>
+          <w:tcPr>
+            <w:tcW w:type="dxa" w:w="1600"/>
+            <w:tcBorders>
+              <w:top w:val="none" w:color="FFFFFF" w:sz="0"/>
+              <w:left w:val="none" w:color="FFFFFF" w:sz="0"/>
+              <w:bottom w:val="none" w:color="FFFFFF" w:sz="0"/>
+              <w:right w:val="none" w:color="FFFFFF" w:sz="0"/>
+            </w:tcBorders>
+            <w:tcMar>
+              <w:top w:type="dxa" w:w="60"/>
+              <w:left w:type="dxa" w:w="80"/>
+              <w:bottom w:type="dxa" w:w="60"/>
+              <w:right w:type="dxa" w:w="80"/>
+            </w:tcMar>
+            <w:vAlign w:val="center"/>
+          </w:tcPr>
+          <w:p>
+            <w:pPr>
+              <w:spacing w:after="0" w:line="240"/>
+              <w:jc w:val="left"/>
+            </w:pPr>
+            <w:r>
+              <w:rPr>
+                <w:b w:val="false"/>
+                <w:bCs w:val="false"/>
+                <w:sz w:val="22"/>
+                <w:szCs w:val="22"/>
+              </w:rPr>
+              <w:t xml:space="preserve">Checked on a printed target with lines 0.1 to 1.0 mm wide</w:t>
+            </w:r>
+          </w:p>
+        </w:tc>
+        <w:tc>
+          <w:tcPr>
+            <w:tcW w:type="dxa" w:w="1776"/>
+            <w:tcBorders>
+              <w:top w:val="none" w:color="FFFFFF" w:sz="0"/>
+              <w:left w:val="none" w:color="FFFFFF" w:sz="0"/>
+              <w:bottom w:val="none" w:color="FFFFFF" w:sz="0"/>
+              <w:right w:val="none" w:color="FFFFFF" w:sz="0"/>
+            </w:tcBorders>
+            <w:tcMar>
+              <w:top w:type="dxa" w:w="60"/>
+              <w:left w:type="dxa" w:w="80"/>
+              <w:bottom w:type="dxa" w:w="60"/>
+              <w:right w:type="dxa" w:w="80"/>
+            </w:tcMar>
+            <w:vAlign w:val="center"/>
+          </w:tcPr>
+          <w:p>
+            <w:pPr>
+              <w:spacing w:after="0" w:line="240"/>
+              <w:jc w:val="left"/>
+            </w:pPr>
+            <w:r>
+              <w:rPr>
+                <w:b w:val="false"/>
+                <w:bCs w:val="false"/>
+                <w:sz w:val="22"/>
+                <w:szCs w:val="22"/>
+              </w:rPr>
+              <w:t xml:space="preserve">Crack width against the 0.3 mm limit of IS 456:2000</w:t>
+            </w:r>
+          </w:p>
+        </w:tc>
+      </w:tr>
+      <w:tr>
+        <w:trPr>
+          <w:cantSplit/>
+        </w:trPr>
+        <w:tc>
+          <w:tcPr>
+            <w:tcW w:type="dxa" w:w="1650"/>
+            <w:tcBorders>
+              <w:top w:val="none" w:color="FFFFFF" w:sz="0"/>
+              <w:left w:val="none" w:color="FFFFFF" w:sz="0"/>
+              <w:bottom w:val="none" w:color="FFFFFF" w:sz="0"/>
+              <w:right w:val="none" w:color="FFFFFF" w:sz="0"/>
+            </w:tcBorders>
+            <w:tcMar>
+              <w:top w:type="dxa" w:w="60"/>
+              <w:left w:type="dxa" w:w="80"/>
+              <w:bottom w:type="dxa" w:w="60"/>
+              <w:right w:type="dxa" w:w="80"/>
+            </w:tcMar>
+            <w:vAlign w:val="center"/>
+          </w:tcPr>
+          <w:p>
+            <w:pPr>
+              <w:spacing w:after="0" w:line="240"/>
+              <w:jc w:val="center"/>
+            </w:pPr>
+            <w:r>
+              <w:rPr>
+                <w:b/>
+                <w:bCs/>
+                <w:sz w:val="22"/>
+                <w:szCs w:val="22"/>
+              </w:rPr>
+              <w:t xml:space="preserve">Temperature</w:t>
+            </w:r>
+          </w:p>
+        </w:tc>
+        <w:tc>
+          <w:tcPr>
+            <w:tcW w:type="dxa" w:w="2300"/>
+            <w:tcBorders>
+              <w:top w:val="none" w:color="FFFFFF" w:sz="0"/>
+              <w:left w:val="none" w:color="FFFFFF" w:sz="0"/>
+              <w:bottom w:val="none" w:color="FFFFFF" w:sz="0"/>
+              <w:right w:val="none" w:color="FFFFFF" w:sz="0"/>
+            </w:tcBorders>
+            <w:tcMar>
+              <w:top w:type="dxa" w:w="60"/>
+              <w:left w:type="dxa" w:w="80"/>
+              <w:bottom w:type="dxa" w:w="60"/>
+              <w:right w:type="dxa" w:w="80"/>
+            </w:tcMar>
+            <w:vAlign w:val="center"/>
+          </w:tcPr>
+          <w:p>
+            <w:pPr>
+              <w:spacing w:after="0" w:line="240"/>
+              <w:jc w:val="left"/>
+            </w:pPr>
+            <w:r>
+              <w:rPr>
+                <w:b w:val="false"/>
+                <w:bCs w:val="false"/>
+                <w:sz w:val="22"/>
+                <w:szCs w:val="22"/>
+              </w:rPr>
+              <w:t xml:space="preserve">Digital temperature sensor</w:t>
+            </w:r>
+          </w:p>
+        </w:tc>
+        <w:tc>
+          <w:tcPr>
+            <w:tcW w:type="dxa" w:w="1700"/>
+            <w:tcBorders>
+              <w:top w:val="none" w:color="FFFFFF" w:sz="0"/>
+              <w:left w:val="none" w:color="FFFFFF" w:sz="0"/>
+              <w:bottom w:val="none" w:color="FFFFFF" w:sz="0"/>
+              <w:right w:val="none" w:color="FFFFFF" w:sz="0"/>
+            </w:tcBorders>
+            <w:tcMar>
+              <w:top w:type="dxa" w:w="60"/>
+              <w:left w:type="dxa" w:w="80"/>
+              <w:bottom w:type="dxa" w:w="60"/>
+              <w:right w:type="dxa" w:w="80"/>
+            </w:tcMar>
+            <w:vAlign w:val="center"/>
+          </w:tcPr>
+          <w:p>
+            <w:pPr>
+              <w:spacing w:after="0" w:line="240"/>
+              <w:jc w:val="left"/>
+            </w:pPr>
+            <w:r>
+              <w:rPr>
+                <w:b w:val="false"/>
+                <w:bCs w:val="false"/>
+                <w:sz w:val="22"/>
+                <w:szCs w:val="22"/>
+              </w:rPr>
+              <w:t xml:space="preserve">Beam surface</w:t>
+            </w:r>
+          </w:p>
+        </w:tc>
+        <w:tc>
+          <w:tcPr>
+            <w:tcW w:type="dxa" w:w="1600"/>
+            <w:tcBorders>
+              <w:top w:val="none" w:color="FFFFFF" w:sz="0"/>
+              <w:left w:val="none" w:color="FFFFFF" w:sz="0"/>
+              <w:bottom w:val="none" w:color="FFFFFF" w:sz="0"/>
+              <w:right w:val="none" w:color="FFFFFF" w:sz="0"/>
+            </w:tcBorders>
+            <w:tcMar>
+              <w:top w:type="dxa" w:w="60"/>
+              <w:left w:type="dxa" w:w="80"/>
+              <w:bottom w:type="dxa" w:w="60"/>
+              <w:right w:type="dxa" w:w="80"/>
+            </w:tcMar>
+            <w:vAlign w:val="center"/>
+          </w:tcPr>
+          <w:p>
+            <w:pPr>
+              <w:spacing w:after="0" w:line="240"/>
+              <w:jc w:val="left"/>
+            </w:pPr>
+            <w:r>
+              <w:rPr>
+                <w:b w:val="false"/>
+                <w:bCs w:val="false"/>
+                <w:sz w:val="22"/>
+                <w:szCs w:val="22"/>
+              </w:rPr>
+              <w:t xml:space="preserve">0.5 °C</w:t>
+            </w:r>
+          </w:p>
+        </w:tc>
+        <w:tc>
+          <w:tcPr>
+            <w:tcW w:type="dxa" w:w="1776"/>
+            <w:tcBorders>
+              <w:top w:val="none" w:color="FFFFFF" w:sz="0"/>
+              <w:left w:val="none" w:color="FFFFFF" w:sz="0"/>
+              <w:bottom w:val="none" w:color="FFFFFF" w:sz="0"/>
+              <w:right w:val="none" w:color="FFFFFF" w:sz="0"/>
+            </w:tcBorders>
+            <w:tcMar>
+              <w:top w:type="dxa" w:w="60"/>
+              <w:left w:type="dxa" w:w="80"/>
+              <w:bottom w:type="dxa" w:w="60"/>
+              <w:right w:type="dxa" w:w="80"/>
+            </w:tcMar>
+            <w:vAlign w:val="center"/>
+          </w:tcPr>
+          <w:p>
+            <w:pPr>
+              <w:spacing w:after="0" w:line="240"/>
+              <w:jc w:val="left"/>
+            </w:pPr>
+            <w:r>
+              <w:rPr>
+                <w:b w:val="false"/>
+                <w:bCs w:val="false"/>
+                <w:sz w:val="22"/>
+                <w:szCs w:val="22"/>
+              </w:rPr>
+              <w:t xml:space="preserve">Corrects the frequency for temperature</w:t>
+            </w:r>
+          </w:p>
+        </w:tc>
+      </w:tr>
+      <w:tr>
+        <w:trPr>
+          <w:cantSplit/>
+        </w:trPr>
+        <w:tc>
+          <w:tcPr>
+            <w:tcW w:type="dxa" w:w="1650"/>
+            <w:tcBorders>
+              <w:top w:val="none" w:color="FFFFFF" w:sz="0"/>
+              <w:left w:val="none" w:color="FFFFFF" w:sz="0"/>
+              <w:bottom w:val="single" w:color="000000" w:sz="8"/>
+              <w:right w:val="none" w:color="FFFFFF" w:sz="0"/>
+            </w:tcBorders>
+            <w:tcMar>
+              <w:top w:type="dxa" w:w="60"/>
+              <w:left w:type="dxa" w:w="80"/>
+              <w:bottom w:type="dxa" w:w="60"/>
+              <w:right w:type="dxa" w:w="80"/>
+            </w:tcMar>
+            <w:vAlign w:val="center"/>
+          </w:tcPr>
+          <w:p>
+            <w:pPr>
+              <w:spacing w:after="0" w:line="240"/>
+              <w:jc w:val="center"/>
+            </w:pPr>
+            <w:r>
+              <w:rPr>
+                <w:b/>
+                <w:bCs/>
+                <w:sz w:val="22"/>
+                <w:szCs w:val="22"/>
+              </w:rPr>
+              <w:t xml:space="preserve">Logging and transfer</w:t>
+            </w:r>
+          </w:p>
+        </w:tc>
+        <w:tc>
+          <w:tcPr>
+            <w:tcW w:type="dxa" w:w="2300"/>
+            <w:tcBorders>
+              <w:top w:val="none" w:color="FFFFFF" w:sz="0"/>
+              <w:left w:val="none" w:color="FFFFFF" w:sz="0"/>
+              <w:bottom w:val="single" w:color="000000" w:sz="8"/>
+              <w:right w:val="none" w:color="FFFFFF" w:sz="0"/>
+            </w:tcBorders>
+            <w:tcMar>
+              <w:top w:type="dxa" w:w="60"/>
+              <w:left w:type="dxa" w:w="80"/>
+              <w:bottom w:type="dxa" w:w="60"/>
+              <w:right w:type="dxa" w:w="80"/>
+            </w:tcMar>
+            <w:vAlign w:val="center"/>
+          </w:tcPr>
+          <w:p>
+            <w:pPr>
+              <w:spacing w:after="0" w:line="240"/>
+              <w:jc w:val="left"/>
+            </w:pPr>
+            <w:r>
+              <w:rPr>
+                <w:b w:val="false"/>
+                <w:bCs w:val="false"/>
+                <w:sz w:val="22"/>
+                <w:szCs w:val="22"/>
+              </w:rPr>
+              <w:t xml:space="preserve">ESP32 microcontroller with a 4G mobile data module</w:t>
+            </w:r>
+          </w:p>
+        </w:tc>
+        <w:tc>
+          <w:tcPr>
+            <w:tcW w:type="dxa" w:w="1700"/>
+            <w:tcBorders>
+              <w:top w:val="none" w:color="FFFFFF" w:sz="0"/>
+              <w:left w:val="none" w:color="FFFFFF" w:sz="0"/>
+              <w:bottom w:val="single" w:color="000000" w:sz="8"/>
+              <w:right w:val="none" w:color="FFFFFF" w:sz="0"/>
+            </w:tcBorders>
+            <w:tcMar>
+              <w:top w:type="dxa" w:w="60"/>
+              <w:left w:type="dxa" w:w="80"/>
+              <w:bottom w:type="dxa" w:w="60"/>
+              <w:right w:type="dxa" w:w="80"/>
+            </w:tcMar>
+            <w:vAlign w:val="center"/>
+          </w:tcPr>
+          <w:p>
+            <w:pPr>
+              <w:spacing w:after="0" w:line="240"/>
+              <w:jc w:val="left"/>
+            </w:pPr>
+            <w:r>
+              <w:rPr>
+                <w:b w:val="false"/>
+                <w:bCs w:val="false"/>
+                <w:sz w:val="22"/>
+                <w:szCs w:val="22"/>
+              </w:rPr>
+              <w:t xml:space="preserve">Beside the beam</w:t>
+            </w:r>
+          </w:p>
+        </w:tc>
+        <w:tc>
+          <w:tcPr>
+            <w:tcW w:type="dxa" w:w="1600"/>
+            <w:tcBorders>
+              <w:top w:val="none" w:color="FFFFFF" w:sz="0"/>
+              <w:left w:val="none" w:color="FFFFFF" w:sz="0"/>
+              <w:bottom w:val="single" w:color="000000" w:sz="8"/>
+              <w:right w:val="none" w:color="FFFFFF" w:sz="0"/>
+            </w:tcBorders>
+            <w:tcMar>
+              <w:top w:type="dxa" w:w="60"/>
+              <w:left w:type="dxa" w:w="80"/>
+              <w:bottom w:type="dxa" w:w="60"/>
+              <w:right w:type="dxa" w:w="80"/>
+            </w:tcMar>
+            <w:vAlign w:val="center"/>
+          </w:tcPr>
+          <w:p>
+            <w:pPr>
+              <w:spacing w:after="0" w:line="240"/>
+              <w:jc w:val="left"/>
+            </w:pPr>
+            <w:r>
+              <w:rPr>
+                <w:b w:val="false"/>
+                <w:bCs w:val="false"/>
+                <w:sz w:val="22"/>
+                <w:szCs w:val="22"/>
+              </w:rPr>
+              <w:t xml:space="preserve">Common time stamp on all channels</w:t>
+            </w:r>
+          </w:p>
+        </w:tc>
+        <w:tc>
+          <w:tcPr>
+            <w:tcW w:type="dxa" w:w="1776"/>
+            <w:tcBorders>
+              <w:top w:val="none" w:color="FFFFFF" w:sz="0"/>
+              <w:left w:val="none" w:color="FFFFFF" w:sz="0"/>
+              <w:bottom w:val="single" w:color="000000" w:sz="8"/>
+              <w:right w:val="none" w:color="FFFFFF" w:sz="0"/>
+            </w:tcBorders>
+            <w:tcMar>
+              <w:top w:type="dxa" w:w="60"/>
+              <w:left w:type="dxa" w:w="80"/>
+              <w:bottom w:type="dxa" w:w="60"/>
+              <w:right w:type="dxa" w:w="80"/>
+            </w:tcMar>
+            <w:vAlign w:val="center"/>
+          </w:tcPr>
+          <w:p>
+            <w:pPr>
+              <w:spacing w:after="0" w:line="240"/>
+              <w:jc w:val="left"/>
+            </w:pPr>
+            <w:r>
+              <w:rPr>
+                <w:b w:val="false"/>
+                <w:bCs w:val="false"/>
+                <w:sz w:val="22"/>
+                <w:szCs w:val="22"/>
+              </w:rPr>
+              <w:t xml:space="preserve">Sends readings and images to the cloud database</w:t>
+            </w:r>
+          </w:p>
+        </w:tc>
+      </w:tr>
+    </w:tbl>
+    <w:p>
+      <w:pPr>
+        <w:spacing w:after="100" w:before="0" w:line="360"/>
+        <w:jc w:val="both"/>
+      </w:pPr>
+      <w:r>
+        <w:t xml:space="preserve">The microcontroller logs all sensors, triggers the tapper and the crack scan, and sends readings and images over the mobile network to a cloud database (PostgreSQL on Supabase), so the data reach the team without a computer in the laboratory. Crack widths are measured from the images in Python with OpenCV: each crack is found, its centre line traced and its width measured in millimetres from the scale markers; this crack finder is to be replaced by a segmentation network trained on public images of cracked concrete. The twin runs in the cloud on these readings, and a dashboard shows the stiffness estimate with its bounds and sends alerts to phones. The cloud database and the twin are built and already run on simulated readings; the sensors, the data link, the crack measurement and the dashboard are planned.</w:t>
+      </w:r>
+    </w:p>
+    <w:p>
+      <w:pPr>
+        <w:spacing w:after="100" w:before="0" w:line="360"/>
+        <w:jc w:val="both"/>
+      </w:pPr>
+      <w:r>
+        <w:t xml:space="preserve">Each beam is first given a reference test at 15 kN, below its cracking load, which gives the initial stiffness from deflection and the natural frequency from a tap test. It is then taken through the damage stages. Before each 30 kN service check the twin predicts the deflection; the beam is then loaded to 30 kN, which is below the previous maximum load, the deflection is measured, the camera scans the constant-moment zone during the hold, and the twin is updated. The repair decision follows the rule of Table 7; the beam is strengthened after the 65 kN stage and finally loaded to failure in displacement control.</w:t>
+      </w:r>
+    </w:p>
     <w:sectPr>
       <w:footerReference w:type="default" r:id="rId8"/>
       <w:pgSz w:w="11906" w:h="16838" w:orient="portrait"/>

</xml_diff>

<commit_message>
Part 1 report: start each chapter on a new page
Co-Authored-By: Claude Opus 5.5 <noreply@anthropic.com>
Claude-Session: https://claude.ai/code/session_014cHUjWVW99MgkXsaKBnv5R
</commit_message>
<xml_diff>
--- a/11_part1_report/StrucIQ_Project_Part1_Report.docx
+++ b/11_part1_report/StrucIQ_Project_Part1_Report.docx
@@ -1165,7 +1165,7 @@
           <w:b w:val="false"/>
           <w:bCs w:val="false"/>
         </w:rPr>
-        <w:t xml:space="preserve">	2</w:t>
+        <w:t xml:space="preserve">	3</w:t>
       </w:r>
     </w:p>
     <w:p>
@@ -1188,7 +1188,7 @@
           <w:b w:val="false"/>
           <w:bCs w:val="false"/>
         </w:rPr>
-        <w:t xml:space="preserve">	3</w:t>
+        <w:t xml:space="preserve">	5</w:t>
       </w:r>
     </w:p>
     <w:p>
@@ -1211,7 +1211,7 @@
           <w:b w:val="false"/>
           <w:bCs w:val="false"/>
         </w:rPr>
-        <w:t xml:space="preserve">	3</w:t>
+        <w:t xml:space="preserve">	5</w:t>
       </w:r>
     </w:p>
     <w:p>
@@ -1234,7 +1234,7 @@
           <w:b w:val="false"/>
           <w:bCs w:val="false"/>
         </w:rPr>
-        <w:t xml:space="preserve">	4</w:t>
+        <w:t xml:space="preserve">	5</w:t>
       </w:r>
     </w:p>
     <w:p>
@@ -1257,7 +1257,7 @@
           <w:b w:val="false"/>
           <w:bCs w:val="false"/>
         </w:rPr>
-        <w:t xml:space="preserve">	4</w:t>
+        <w:t xml:space="preserve">	5</w:t>
       </w:r>
     </w:p>
     <w:p>
@@ -1280,7 +1280,7 @@
           <w:b w:val="false"/>
           <w:bCs w:val="false"/>
         </w:rPr>
-        <w:t xml:space="preserve">	6</w:t>
+        <w:t xml:space="preserve">	7</w:t>
       </w:r>
     </w:p>
     <w:p>
@@ -1303,7 +1303,7 @@
           <w:b w:val="false"/>
           <w:bCs w:val="false"/>
         </w:rPr>
-        <w:t xml:space="preserve">	6</w:t>
+        <w:t xml:space="preserve">	8</w:t>
       </w:r>
     </w:p>
     <w:p>
@@ -1326,7 +1326,7 @@
           <w:b w:val="false"/>
           <w:bCs w:val="false"/>
         </w:rPr>
-        <w:t xml:space="preserve">	6</w:t>
+        <w:t xml:space="preserve">	8</w:t>
       </w:r>
     </w:p>
     <w:p>
@@ -1349,7 +1349,7 @@
           <w:b w:val="false"/>
           <w:bCs w:val="false"/>
         </w:rPr>
-        <w:t xml:space="preserve">	7</w:t>
+        <w:t xml:space="preserve">	8</w:t>
       </w:r>
     </w:p>
     <w:p>
@@ -1372,7 +1372,7 @@
           <w:b w:val="false"/>
           <w:bCs w:val="false"/>
         </w:rPr>
-        <w:t xml:space="preserve">	7</w:t>
+        <w:t xml:space="preserve">	8</w:t>
       </w:r>
     </w:p>
     <w:p>
@@ -1395,7 +1395,7 @@
           <w:b w:val="false"/>
           <w:bCs w:val="false"/>
         </w:rPr>
-        <w:t xml:space="preserve">	7</w:t>
+        <w:t xml:space="preserve">	9</w:t>
       </w:r>
     </w:p>
     <w:p>
@@ -1418,7 +1418,7 @@
           <w:b w:val="false"/>
           <w:bCs w:val="false"/>
         </w:rPr>
-        <w:t xml:space="preserve">	8</w:t>
+        <w:t xml:space="preserve">	9</w:t>
       </w:r>
     </w:p>
     <w:p>
@@ -1441,7 +1441,7 @@
           <w:b w:val="false"/>
           <w:bCs w:val="false"/>
         </w:rPr>
-        <w:t xml:space="preserve">	8</w:t>
+        <w:t xml:space="preserve">	10</w:t>
       </w:r>
     </w:p>
     <w:p>
@@ -1464,7 +1464,7 @@
           <w:b w:val="false"/>
           <w:bCs w:val="false"/>
         </w:rPr>
-        <w:t xml:space="preserve">	9</w:t>
+        <w:t xml:space="preserve">	10</w:t>
       </w:r>
     </w:p>
     <w:p>
@@ -1487,7 +1487,7 @@
           <w:b w:val="false"/>
           <w:bCs w:val="false"/>
         </w:rPr>
-        <w:t xml:space="preserve">	9</w:t>
+        <w:t xml:space="preserve">	12</w:t>
       </w:r>
     </w:p>
     <w:p>
@@ -1510,7 +1510,7 @@
           <w:b w:val="false"/>
           <w:bCs w:val="false"/>
         </w:rPr>
-        <w:t xml:space="preserve">	10</w:t>
+        <w:t xml:space="preserve">	13</w:t>
       </w:r>
     </w:p>
     <w:p>
@@ -1533,7 +1533,7 @@
           <w:b w:val="false"/>
           <w:bCs w:val="false"/>
         </w:rPr>
-        <w:t xml:space="preserve">	11</w:t>
+        <w:t xml:space="preserve">	14</w:t>
       </w:r>
     </w:p>
     <w:p>
@@ -1556,7 +1556,7 @@
           <w:b w:val="false"/>
           <w:bCs w:val="false"/>
         </w:rPr>
-        <w:t xml:space="preserve">	11</w:t>
+        <w:t xml:space="preserve">	15</w:t>
       </w:r>
     </w:p>
     <w:p>
@@ -1579,7 +1579,7 @@
           <w:b w:val="false"/>
           <w:bCs w:val="false"/>
         </w:rPr>
-        <w:t xml:space="preserve">	14</w:t>
+        <w:t xml:space="preserve">	18</w:t>
       </w:r>
     </w:p>
     <w:p>
@@ -1617,7 +1617,7 @@
         <w:t xml:space="preserve">Figure 1. </w:t>
       </w:r>
       <w:r>
-        <w:t xml:space="preserve">Specimen Elevation and Cross-Section Under Four-Point Bending	4</w:t>
+        <w:t xml:space="preserve">Specimen Elevation and Cross-Section Under Four-Point Bending	5</w:t>
       </w:r>
     </w:p>
     <w:p>
@@ -1635,7 +1635,7 @@
         <w:t xml:space="preserve">Figure 2. </w:t>
       </w:r>
       <w:r>
-        <w:t xml:space="preserve">Methodology Flow Diagram	5</w:t>
+        <w:t xml:space="preserve">Methodology Flow Diagram	6</w:t>
       </w:r>
     </w:p>
     <w:p>
@@ -1653,7 +1653,7 @@
         <w:t xml:space="preserve">Figure 3. </w:t>
       </w:r>
       <w:r>
-        <w:t xml:space="preserve">Sobol Total Indices of the Stiffness Left After 72 kN	7</w:t>
+        <w:t xml:space="preserve">Sobol Total Indices of the Stiffness Left After 72 kN	9</w:t>
       </w:r>
     </w:p>
     <w:p>
@@ -1671,7 +1671,7 @@
         <w:t xml:space="preserve">Figure 4. </w:t>
       </w:r>
       <w:r>
-        <w:t xml:space="preserve">Median Deflection Error at 72 kN for Four Estimators	7</w:t>
+        <w:t xml:space="preserve">Median Deflection Error at 72 kN for Four Estimators	9</w:t>
       </w:r>
     </w:p>
     <w:p>
@@ -1689,7 +1689,7 @@
         <w:t xml:space="preserve">Figure 5. </w:t>
       </w:r>
       <w:r>
-        <w:t xml:space="preserve">Least Intrusive Compliant Scheme Across 10,000 Beams	8</w:t>
+        <w:t xml:space="preserve">Least Intrusive Compliant Scheme Across 10,000 Beams	10</w:t>
       </w:r>
     </w:p>
     <w:p>
@@ -1707,7 +1707,7 @@
         <w:t xml:space="preserve">Figure 6. </w:t>
       </w:r>
       <w:r>
-        <w:t xml:space="preserve">Share of Beams Where Each Scheme Complies	8</w:t>
+        <w:t xml:space="preserve">Share of Beams Where Each Scheme Complies	10</w:t>
       </w:r>
     </w:p>
     <w:p>
@@ -1725,7 +1725,7 @@
         <w:t xml:space="preserve">Figure 7. </w:t>
       </w:r>
       <w:r>
-        <w:t xml:space="preserve">Gantt Chart of the Project	10</w:t>
+        <w:t xml:space="preserve">Gantt Chart of the Project	13</w:t>
       </w:r>
     </w:p>
     <w:p>
@@ -1743,7 +1743,7 @@
         <w:t xml:space="preserve">Figure A-1. </w:t>
       </w:r>
       <w:r>
-        <w:t xml:space="preserve">Static Against Vibration Stiffness Loss, 10,000 Beams	16</w:t>
+        <w:t xml:space="preserve">Static Against Vibration Stiffness Loss, 10,000 Beams	20</w:t>
       </w:r>
     </w:p>
     <w:p>
@@ -1761,7 +1761,7 @@
         <w:t xml:space="preserve">Figure A-2. </w:t>
       </w:r>
       <w:r>
-        <w:t xml:space="preserve">Growth of Deflection Under Sustained Load	16</w:t>
+        <w:t xml:space="preserve">Growth of Deflection Under Sustained Load	20</w:t>
       </w:r>
     </w:p>
     <w:p>
@@ -1835,7 +1835,7 @@
         <w:t xml:space="preserve">Table 3. </w:t>
       </w:r>
       <w:r>
-        <w:t xml:space="preserve">Materials and Random Inputs of the Monte Carlo Simulation	4</w:t>
+        <w:t xml:space="preserve">Materials and Random Inputs of the Monte Carlo Simulation	5</w:t>
       </w:r>
     </w:p>
     <w:p>
@@ -1853,7 +1853,7 @@
         <w:t xml:space="preserve">Table 4. </w:t>
       </w:r>
       <w:r>
-        <w:t xml:space="preserve">Deflection Stiffness Left at Three Load Levels	6</w:t>
+        <w:t xml:space="preserve">Deflection Stiffness Left at Three Load Levels	8</w:t>
       </w:r>
     </w:p>
     <w:p>
@@ -1871,7 +1871,7 @@
         <w:t xml:space="preserve">Table 5. </w:t>
       </w:r>
       <w:r>
-        <w:t xml:space="preserve">Blind Prediction Against a Published Test	7</w:t>
+        <w:t xml:space="preserve">Blind Prediction Against a Published Test	9</w:t>
       </w:r>
     </w:p>
     <w:p>
@@ -1889,7 +1889,7 @@
         <w:t xml:space="preserve">Table 6. </w:t>
       </w:r>
       <w:r>
-        <w:t xml:space="preserve">Decision Tree Performance	8</w:t>
+        <w:t xml:space="preserve">Decision Tree Performance	10</w:t>
       </w:r>
     </w:p>
     <w:p>
@@ -1907,7 +1907,7 @@
         <w:t xml:space="preserve">Table 7. </w:t>
       </w:r>
       <w:r>
-        <w:t xml:space="preserve">Repair Rule for the Specimens	9</w:t>
+        <w:t xml:space="preserve">Repair Rule for the Specimens	10</w:t>
       </w:r>
     </w:p>
     <w:p>
@@ -1925,7 +1925,7 @@
         <w:t xml:space="preserve">Table 8. </w:t>
       </w:r>
       <w:r>
-        <w:t xml:space="preserve">Achievements of Part 1	11</w:t>
+        <w:t xml:space="preserve">Achievements of Part 1	14</w:t>
       </w:r>
     </w:p>
     <w:p>
@@ -1943,7 +1943,7 @@
         <w:t xml:space="preserve">Table A-1. </w:t>
       </w:r>
       <w:r>
-        <w:t xml:space="preserve">Ranges of the Design-Space Population	14</w:t>
+        <w:t xml:space="preserve">Ranges of the Design-Space Population	18</w:t>
       </w:r>
     </w:p>
     <w:p>
@@ -1961,7 +1961,7 @@
         <w:t xml:space="preserve">Table A-2. </w:t>
       </w:r>
       <w:r>
-        <w:t xml:space="preserve">Stiffness Left and Vibration Fraction by Damage Stage	15</w:t>
+        <w:t xml:space="preserve">Stiffness Left and Vibration Fraction by Damage Stage	19</w:t>
       </w:r>
     </w:p>
     <w:p>
@@ -1979,7 +1979,7 @@
         <w:t xml:space="preserve">Table A-3. </w:t>
       </w:r>
       <w:r>
-        <w:t xml:space="preserve">Condition Stages of the Design-Space Dataset	16</w:t>
+        <w:t xml:space="preserve">Condition Stages of the Design-Space Dataset	20</w:t>
       </w:r>
     </w:p>
     <w:p>
@@ -1997,7 +1997,7 @@
         <w:t xml:space="preserve">Table A-4. </w:t>
       </w:r>
       <w:r>
-        <w:t xml:space="preserve">Mesh Convergence and Independent Elastic Check	17</w:t>
+        <w:t xml:space="preserve">Mesh Convergence and Independent Elastic Check	21</w:t>
       </w:r>
     </w:p>
     <w:p>
@@ -2015,7 +2015,7 @@
         <w:t xml:space="preserve">Table A-5. </w:t>
       </w:r>
       <w:r>
-        <w:t xml:space="preserve">Capacities of the Supporting Published Programme	17</w:t>
+        <w:t xml:space="preserve">Capacities of the Supporting Published Programme	21</w:t>
       </w:r>
     </w:p>
     <w:p>
@@ -2033,7 +2033,7 @@
         <w:t xml:space="preserve">Table A-6. </w:t>
       </w:r>
       <w:r>
-        <w:t xml:space="preserve">Planned Instrumentation of the Part 2 Beam Tests	18</w:t>
+        <w:t xml:space="preserve">Planned Instrumentation of the Part 2 Beam Tests	22</w:t>
       </w:r>
     </w:p>
     <w:p>
@@ -3608,6 +3608,7 @@
       <w:pPr>
         <w:pStyle w:val="Heading1"/>
         <w:keepNext/>
+        <w:pageBreakBefore/>
         <w:spacing w:after="160" w:before="320" w:line="300"/>
         <w:jc w:val="center"/>
       </w:pPr>
@@ -4261,6 +4262,7 @@
       <w:pPr>
         <w:pStyle w:val="Heading1"/>
         <w:keepNext/>
+        <w:pageBreakBefore/>
         <w:spacing w:after="160" w:before="320" w:line="300"/>
         <w:jc w:val="center"/>
       </w:pPr>
@@ -5151,6 +5153,7 @@
       <w:pPr>
         <w:pStyle w:val="Heading1"/>
         <w:keepNext/>
+        <w:pageBreakBefore/>
         <w:spacing w:after="160" w:before="320" w:line="300"/>
         <w:jc w:val="center"/>
       </w:pPr>
@@ -7971,6 +7974,7 @@
       <w:pPr>
         <w:pStyle w:val="Heading1"/>
         <w:keepNext/>
+        <w:pageBreakBefore/>
         <w:spacing w:after="160" w:before="320" w:line="300"/>
         <w:jc w:val="center"/>
       </w:pPr>
@@ -8025,6 +8029,7 @@
       <w:pPr>
         <w:pStyle w:val="Heading1"/>
         <w:keepNext/>
+        <w:pageBreakBefore/>
         <w:spacing w:after="160" w:before="320" w:line="300"/>
         <w:jc w:val="center"/>
       </w:pPr>
@@ -8121,6 +8126,7 @@
       <w:pPr>
         <w:pStyle w:val="Heading1"/>
         <w:keepNext/>
+        <w:pageBreakBefore/>
         <w:spacing w:after="160" w:before="320" w:line="300"/>
         <w:jc w:val="center"/>
       </w:pPr>
@@ -8693,6 +8699,7 @@
       <w:pPr>
         <w:pStyle w:val="Heading1"/>
         <w:keepNext/>
+        <w:pageBreakBefore/>
         <w:spacing w:after="160" w:before="320" w:line="300"/>
         <w:jc w:val="center"/>
       </w:pPr>

</xml_diff>